<commit_message>
feat(dca): initials-based header, placeholder fill, confidential filename
- Add _compute_initials(): first letter of each word, includes second letter
  if both leading consonants (e.g. "Ayoub Jbili" → AJB)
- Add _fill_simplified_header_table(): replaces {{INITIALES}}, {{TITRE_POSTE}},
  {{DISPONIBILITE}} tokens in table[0] cell runs (document.paragraphs skips
  table cells, so scan cell.paragraphs directly)
- Replace all empty-value fallbacks '—' with _EMPTY = 'A Compléter'
- Filename format: aa.mm.jj_DC ACHMITECH_<initials>.docx (no candidate name,
  confidential); Alten variant uses DC ALTEN instead
- _fill_dca_template_by_layout accepts table_offset for future flexibility
- _prune_unused_project_sections accepts project_start_table_idx param
</commit_message>
<xml_diff>
--- a/achmitech_hr_recruitment/static/src/docx/dca_alten_template.docx
+++ b/achmitech_hr_recruitment/static/src/docx/dca_alten_template.docx
@@ -1,10 +1,10 @@
 
 <file path=word/document.xml><?xml version="1.0" encoding="utf-8"?>
-<w:document xmlns:wpc="http://schemas.microsoft.com/office/word/2010/wordprocessingCanvas" xmlns:mc="http://schemas.openxmlformats.org/markup-compatibility/2006" xmlns:o="urn:schemas-microsoft-com:office:office" xmlns:r="http://schemas.openxmlformats.org/officeDocument/2006/relationships" xmlns:m="http://schemas.openxmlformats.org/officeDocument/2006/math" xmlns:v="urn:schemas-microsoft-com:vml" xmlns:wp14="http://schemas.microsoft.com/office/word/2010/wordprocessingDrawing" xmlns:wp="http://schemas.openxmlformats.org/drawingml/2006/wordprocessingDrawing" xmlns:w10="urn:schemas-microsoft-com:office:word" xmlns:w="http://schemas.openxmlformats.org/wordprocessingml/2006/main" xmlns:w14="http://schemas.microsoft.com/office/word/2010/wordml" xmlns:w15="http://schemas.microsoft.com/office/word/2012/wordml" xmlns:wpg="http://schemas.microsoft.com/office/word/2010/wordprocessingGroup" xmlns:wpi="http://schemas.microsoft.com/office/word/2010/wordprocessingInk" xmlns:wne="http://schemas.microsoft.com/office/word/2006/wordml" xmlns:wps="http://schemas.microsoft.com/office/word/2010/wordprocessingShape" mc:Ignorable="w14 w15 wp14">
+<w:document xmlns:wpc="http://schemas.microsoft.com/office/word/2010/wordprocessingCanvas" xmlns:cx="http://schemas.microsoft.com/office/drawing/2014/chartex" xmlns:cx1="http://schemas.microsoft.com/office/drawing/2015/9/8/chartex" xmlns:cx2="http://schemas.microsoft.com/office/drawing/2015/10/21/chartex" xmlns:cx3="http://schemas.microsoft.com/office/drawing/2016/5/9/chartex" xmlns:cx4="http://schemas.microsoft.com/office/drawing/2016/5/10/chartex" xmlns:cx5="http://schemas.microsoft.com/office/drawing/2016/5/11/chartex" xmlns:cx6="http://schemas.microsoft.com/office/drawing/2016/5/12/chartex" xmlns:cx7="http://schemas.microsoft.com/office/drawing/2016/5/13/chartex" xmlns:cx8="http://schemas.microsoft.com/office/drawing/2016/5/14/chartex" xmlns:mc="http://schemas.openxmlformats.org/markup-compatibility/2006" xmlns:aink="http://schemas.microsoft.com/office/drawing/2016/ink" xmlns:am3d="http://schemas.microsoft.com/office/drawing/2017/model3d" xmlns:o="urn:schemas-microsoft-com:office:office" xmlns:oel="http://schemas.microsoft.com/office/2019/extlst" xmlns:r="http://schemas.openxmlformats.org/officeDocument/2006/relationships" xmlns:m="http://schemas.openxmlformats.org/officeDocument/2006/math" xmlns:v="urn:schemas-microsoft-com:vml" xmlns:wp14="http://schemas.microsoft.com/office/word/2010/wordprocessingDrawing" xmlns:wp="http://schemas.openxmlformats.org/drawingml/2006/wordprocessingDrawing" xmlns:w10="urn:schemas-microsoft-com:office:word" xmlns:w="http://schemas.openxmlformats.org/wordprocessingml/2006/main" xmlns:w14="http://schemas.microsoft.com/office/word/2010/wordml" xmlns:w15="http://schemas.microsoft.com/office/word/2012/wordml" xmlns:w16cex="http://schemas.microsoft.com/office/word/2018/wordml/cex" xmlns:w16cid="http://schemas.microsoft.com/office/word/2016/wordml/cid" xmlns:w16="http://schemas.microsoft.com/office/word/2018/wordml" xmlns:w16du="http://schemas.microsoft.com/office/word/2023/wordml/word16du" xmlns:w16sdtdh="http://schemas.microsoft.com/office/word/2020/wordml/sdtdatahash" xmlns:w16sdtfl="http://schemas.microsoft.com/office/word/2024/wordml/sdtformatlock" xmlns:w16se="http://schemas.microsoft.com/office/word/2015/wordml/symex" xmlns:wpg="http://schemas.microsoft.com/office/word/2010/wordprocessingGroup" xmlns:wpi="http://schemas.microsoft.com/office/word/2010/wordprocessingInk" xmlns:wne="http://schemas.microsoft.com/office/word/2006/wordml" xmlns:wps="http://schemas.microsoft.com/office/word/2010/wordprocessingShape" mc:Ignorable="w14 w15 w16se w16cid w16 w16cex w16sdtdh w16sdtfl w16du wp14">
   <w:body>
     <w:tbl>
       <w:tblPr>
-        <w:tblStyle w:val="TableGrid"/>
+        <w:tblStyle w:val="Grilledutableau"/>
         <w:tblW w:w="5000" w:type="pct"/>
         <w:tblBorders>
           <w:top w:val="none" w:sz="0" w:space="0" w:color="auto"/>
@@ -284,7 +284,7 @@
               </wp:anchor>
             </w:drawing>
           </mc:Choice>
-          <mc:Fallback xmlns:oel="http://schemas.microsoft.com/office/2019/extlst" xmlns:w16du="http://schemas.microsoft.com/office/word/2023/wordml/word16du" xmlns:w16sdtfl="http://schemas.microsoft.com/office/word/2024/wordml/sdtformatlock" xmlns:a14="http://schemas.microsoft.com/office/drawing/2010/main" xmlns:a="http://schemas.openxmlformats.org/drawingml/2006/main" xmlns:w16se="http://schemas.microsoft.com/office/word/2015/wordml/symex" xmlns:w16sdtdh="http://schemas.microsoft.com/office/word/2020/wordml/sdtdatahash" xmlns:w16="http://schemas.microsoft.com/office/word/2018/wordml" xmlns:w16cid="http://schemas.microsoft.com/office/word/2016/wordml/cid" xmlns:w16cex="http://schemas.microsoft.com/office/word/2018/wordml/cex" xmlns:am3d="http://schemas.microsoft.com/office/drawing/2017/model3d" xmlns:aink="http://schemas.microsoft.com/office/drawing/2016/ink" xmlns:cx8="http://schemas.microsoft.com/office/drawing/2016/5/14/chartex" xmlns:cx7="http://schemas.microsoft.com/office/drawing/2016/5/13/chartex" xmlns:cx6="http://schemas.microsoft.com/office/drawing/2016/5/12/chartex" xmlns:cx5="http://schemas.microsoft.com/office/drawing/2016/5/11/chartex" xmlns:cx4="http://schemas.microsoft.com/office/drawing/2016/5/10/chartex" xmlns:cx3="http://schemas.microsoft.com/office/drawing/2016/5/9/chartex" xmlns:cx2="http://schemas.microsoft.com/office/drawing/2015/10/21/chartex" xmlns:cx1="http://schemas.microsoft.com/office/drawing/2015/9/8/chartex" xmlns:cx="http://schemas.microsoft.com/office/drawing/2014/chartex">
+          <mc:Fallback xmlns:a="http://schemas.openxmlformats.org/drawingml/2006/main" xmlns:a14="http://schemas.microsoft.com/office/drawing/2010/main">
             <w:pict>
               <v:group id="Zone de dessin 6" style="position:absolute;margin-left:.1pt;margin-top:4pt;width:496.15pt;height:14.85pt;z-index:-251657216" coordsize="63011,1885" o:spid="_x0000_s1026" editas="canvas" w14:anchorId="316664EE" o:gfxdata="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">
                 <v:shape id="_x0000_s1027" style="position:absolute;width:63011;height:1885;visibility:visible;mso-wrap-style:square" type="#_x0000_t75">
@@ -818,7 +818,7 @@
               </wp:anchor>
             </w:drawing>
           </mc:Choice>
-          <mc:Fallback xmlns:oel="http://schemas.microsoft.com/office/2019/extlst" xmlns:w16du="http://schemas.microsoft.com/office/word/2023/wordml/word16du" xmlns:w16sdtfl="http://schemas.microsoft.com/office/word/2024/wordml/sdtformatlock" xmlns:a14="http://schemas.microsoft.com/office/drawing/2010/main" xmlns:a="http://schemas.openxmlformats.org/drawingml/2006/main" xmlns:w16se="http://schemas.microsoft.com/office/word/2015/wordml/symex" xmlns:w16sdtdh="http://schemas.microsoft.com/office/word/2020/wordml/sdtdatahash" xmlns:w16="http://schemas.microsoft.com/office/word/2018/wordml" xmlns:w16cid="http://schemas.microsoft.com/office/word/2016/wordml/cid" xmlns:w16cex="http://schemas.microsoft.com/office/word/2018/wordml/cex" xmlns:am3d="http://schemas.microsoft.com/office/drawing/2017/model3d" xmlns:aink="http://schemas.microsoft.com/office/drawing/2016/ink" xmlns:cx8="http://schemas.microsoft.com/office/drawing/2016/5/14/chartex" xmlns:cx7="http://schemas.microsoft.com/office/drawing/2016/5/13/chartex" xmlns:cx6="http://schemas.microsoft.com/office/drawing/2016/5/12/chartex" xmlns:cx5="http://schemas.microsoft.com/office/drawing/2016/5/11/chartex" xmlns:cx4="http://schemas.microsoft.com/office/drawing/2016/5/10/chartex" xmlns:cx3="http://schemas.microsoft.com/office/drawing/2016/5/9/chartex" xmlns:cx2="http://schemas.microsoft.com/office/drawing/2015/10/21/chartex" xmlns:cx1="http://schemas.microsoft.com/office/drawing/2015/9/8/chartex" xmlns:cx="http://schemas.microsoft.com/office/drawing/2014/chartex">
+          <mc:Fallback xmlns:a="http://schemas.openxmlformats.org/drawingml/2006/main" xmlns:a14="http://schemas.microsoft.com/office/drawing/2010/main">
             <w:pict>
               <v:group id="Zone de dessin 12" style="position:absolute;margin-left:.2pt;margin-top:3.95pt;width:496.15pt;height:14.85pt;z-index:-251656192" coordsize="63011,1885" o:spid="_x0000_s1026" editas="canvas" w14:anchorId="354475EC" o:gfxdata="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">
                 <v:shape id="_x0000_s1027" style="position:absolute;width:63011;height:1885;visibility:visible;mso-wrap-style:square" type="#_x0000_t75">
@@ -1284,7 +1284,7 @@
               </wp:anchor>
             </w:drawing>
           </mc:Choice>
-          <mc:Fallback xmlns:oel="http://schemas.microsoft.com/office/2019/extlst" xmlns:w16du="http://schemas.microsoft.com/office/word/2023/wordml/word16du" xmlns:w16sdtfl="http://schemas.microsoft.com/office/word/2024/wordml/sdtformatlock" xmlns:a14="http://schemas.microsoft.com/office/drawing/2010/main" xmlns:a="http://schemas.openxmlformats.org/drawingml/2006/main" xmlns:w16se="http://schemas.microsoft.com/office/word/2015/wordml/symex" xmlns:w16sdtdh="http://schemas.microsoft.com/office/word/2020/wordml/sdtdatahash" xmlns:w16="http://schemas.microsoft.com/office/word/2018/wordml" xmlns:w16cid="http://schemas.microsoft.com/office/word/2016/wordml/cid" xmlns:w16cex="http://schemas.microsoft.com/office/word/2018/wordml/cex" xmlns:am3d="http://schemas.microsoft.com/office/drawing/2017/model3d" xmlns:aink="http://schemas.microsoft.com/office/drawing/2016/ink" xmlns:cx8="http://schemas.microsoft.com/office/drawing/2016/5/14/chartex" xmlns:cx7="http://schemas.microsoft.com/office/drawing/2016/5/13/chartex" xmlns:cx6="http://schemas.microsoft.com/office/drawing/2016/5/12/chartex" xmlns:cx5="http://schemas.microsoft.com/office/drawing/2016/5/11/chartex" xmlns:cx4="http://schemas.microsoft.com/office/drawing/2016/5/10/chartex" xmlns:cx3="http://schemas.microsoft.com/office/drawing/2016/5/9/chartex" xmlns:cx2="http://schemas.microsoft.com/office/drawing/2015/10/21/chartex" xmlns:cx1="http://schemas.microsoft.com/office/drawing/2015/9/8/chartex" xmlns:cx="http://schemas.microsoft.com/office/drawing/2014/chartex">
+          <mc:Fallback xmlns:a="http://schemas.openxmlformats.org/drawingml/2006/main" xmlns:a14="http://schemas.microsoft.com/office/drawing/2010/main">
             <w:pict>
               <v:group id="Zone de dessin 18" style="position:absolute;margin-left:1.1pt;margin-top:3.6pt;width:496.15pt;height:14.85pt;z-index:-251658240" coordsize="63011,1885" o:spid="_x0000_s1026" editas="canvas" w14:anchorId="6A143A95" o:gfxdata="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">
                 <v:shape id="_x0000_s1027" style="position:absolute;width:63011;height:1885;visibility:visible;mso-wrap-style:square" type="#_x0000_t75">
@@ -1406,7 +1406,7 @@
     </w:p>
     <w:tbl>
       <w:tblPr>
-        <w:tblStyle w:val="TableGrid"/>
+        <w:tblStyle w:val="Grilledutableau"/>
         <w:tblW w:w="0" w:type="auto"/>
         <w:tblBorders>
           <w:top w:val="none" w:sz="0" w:space="0" w:color="auto"/>
@@ -1445,19 +1445,9 @@
                 <w:i w:val="0"/>
                 <w:sz w:val="28"/>
                 <w:szCs w:val="28"/>
-                <w:highlight w:val="yellow"/>
-                <w:lang w:val="en-US"/>
-              </w:rPr>
-              <w:t>Client final</w:t>
-            </w:r>
-            <w:r>
-              <w:rPr>
-                <w:i w:val="0"/>
-                <w:sz w:val="28"/>
-                <w:szCs w:val="28"/>
-                <w:lang w:val="en-US"/>
-              </w:rPr>
-              <w:t xml:space="preserve">  </w:t>
+                <w:lang w:val="en-US"/>
+              </w:rPr>
+              <w:t xml:space="preserve">Client final  </w:t>
             </w:r>
           </w:p>
         </w:tc>
@@ -1476,7 +1466,6 @@
                 <w:i w:val="0"/>
                 <w:sz w:val="22"/>
                 <w:szCs w:val="22"/>
-                <w:highlight w:val="yellow"/>
               </w:rPr>
             </w:pPr>
             <w:r>
@@ -1484,7 +1473,6 @@
                 <w:i w:val="0"/>
                 <w:sz w:val="22"/>
                 <w:szCs w:val="22"/>
-                <w:highlight w:val="yellow"/>
               </w:rPr>
               <w:t>Date début – Date de fin</w:t>
             </w:r>
@@ -1540,7 +1528,7 @@
     </w:p>
     <w:p>
       <w:pPr>
-        <w:pStyle w:val="ListParagraph"/>
+        <w:pStyle w:val="Paragraphedeliste"/>
         <w:numPr>
           <w:ilvl w:val="0"/>
           <w:numId w:val="39"/>
@@ -2172,7 +2160,6 @@
                 <w:lang w:val="en-US"/>
               </w:rPr>
             </w:pPr>
-            <w:proofErr w:type="spellStart"/>
             <w:r>
               <w:rPr>
                 <w:b/>
@@ -2184,7 +2171,6 @@
               </w:rPr>
               <w:t>Systèmes</w:t>
             </w:r>
-            <w:proofErr w:type="spellEnd"/>
           </w:p>
         </w:tc>
         <w:tc>
@@ -2387,7 +2373,7 @@
     </w:p>
     <w:tbl>
       <w:tblPr>
-        <w:tblStyle w:val="TableGrid"/>
+        <w:tblStyle w:val="Grilledutableau"/>
         <w:tblW w:w="0" w:type="auto"/>
         <w:tblBorders>
           <w:top w:val="none" w:sz="0" w:space="0" w:color="auto"/>
@@ -2426,19 +2412,9 @@
                 <w:i w:val="0"/>
                 <w:sz w:val="28"/>
                 <w:szCs w:val="28"/>
-                <w:highlight w:val="yellow"/>
-                <w:lang w:val="en-US"/>
-              </w:rPr>
-              <w:t>Client final</w:t>
-            </w:r>
-            <w:r>
-              <w:rPr>
-                <w:i w:val="0"/>
-                <w:sz w:val="28"/>
-                <w:szCs w:val="28"/>
-                <w:lang w:val="en-US"/>
-              </w:rPr>
-              <w:t xml:space="preserve">  </w:t>
+                <w:lang w:val="en-US"/>
+              </w:rPr>
+              <w:t xml:space="preserve">Client final  </w:t>
             </w:r>
           </w:p>
         </w:tc>
@@ -2457,7 +2433,6 @@
                 <w:i w:val="0"/>
                 <w:sz w:val="22"/>
                 <w:szCs w:val="22"/>
-                <w:highlight w:val="yellow"/>
               </w:rPr>
             </w:pPr>
             <w:r>
@@ -2465,7 +2440,6 @@
                 <w:i w:val="0"/>
                 <w:sz w:val="22"/>
                 <w:szCs w:val="22"/>
-                <w:highlight w:val="yellow"/>
               </w:rPr>
               <w:t>Date début – Date de fin</w:t>
             </w:r>
@@ -2512,7 +2486,7 @@
     </w:p>
     <w:p>
       <w:pPr>
-        <w:pStyle w:val="ListParagraph"/>
+        <w:pStyle w:val="Paragraphedeliste"/>
         <w:numPr>
           <w:ilvl w:val="0"/>
           <w:numId w:val="39"/>
@@ -3137,7 +3111,6 @@
                 <w:lang w:val="en-US"/>
               </w:rPr>
             </w:pPr>
-            <w:proofErr w:type="spellStart"/>
             <w:r>
               <w:rPr>
                 <w:b/>
@@ -3149,7 +3122,6 @@
               </w:rPr>
               <w:t>Systèmes</w:t>
             </w:r>
-            <w:proofErr w:type="spellEnd"/>
           </w:p>
         </w:tc>
         <w:tc>
@@ -3340,7 +3312,7 @@
     </w:p>
     <w:tbl>
       <w:tblPr>
-        <w:tblStyle w:val="TableGrid"/>
+        <w:tblStyle w:val="Grilledutableau"/>
         <w:tblW w:w="0" w:type="auto"/>
         <w:tblBorders>
           <w:top w:val="none" w:sz="0" w:space="0" w:color="auto"/>
@@ -3454,7 +3426,7 @@
     </w:p>
     <w:p>
       <w:pPr>
-        <w:pStyle w:val="ListParagraph"/>
+        <w:pStyle w:val="Paragraphedeliste"/>
         <w:numPr>
           <w:ilvl w:val="0"/>
           <w:numId w:val="39"/>
@@ -4097,7 +4069,6 @@
                 <w:lang w:val="en-US"/>
               </w:rPr>
             </w:pPr>
-            <w:proofErr w:type="spellStart"/>
             <w:r>
               <w:rPr>
                 <w:b/>
@@ -4109,7 +4080,6 @@
               </w:rPr>
               <w:t>Systèmes</w:t>
             </w:r>
-            <w:proofErr w:type="spellEnd"/>
           </w:p>
         </w:tc>
         <w:tc>
@@ -4300,7 +4270,7 @@
     </w:p>
     <w:tbl>
       <w:tblPr>
-        <w:tblStyle w:val="TableGrid"/>
+        <w:tblStyle w:val="Grilledutableau"/>
         <w:tblW w:w="0" w:type="auto"/>
         <w:tblBorders>
           <w:top w:val="none" w:sz="0" w:space="0" w:color="auto"/>
@@ -4406,7 +4376,7 @@
     </w:p>
     <w:p>
       <w:pPr>
-        <w:pStyle w:val="ListParagraph"/>
+        <w:pStyle w:val="Paragraphedeliste"/>
         <w:numPr>
           <w:ilvl w:val="0"/>
           <w:numId w:val="39"/>
@@ -5034,7 +5004,6 @@
                 <w:lang w:val="en-US"/>
               </w:rPr>
             </w:pPr>
-            <w:proofErr w:type="spellStart"/>
             <w:r>
               <w:rPr>
                 <w:b/>
@@ -5046,7 +5015,6 @@
               </w:rPr>
               <w:t>Systèmes</w:t>
             </w:r>
-            <w:proofErr w:type="spellEnd"/>
           </w:p>
         </w:tc>
         <w:tc>
@@ -5237,7 +5205,7 @@
     </w:p>
     <w:tbl>
       <w:tblPr>
-        <w:tblStyle w:val="TableGrid"/>
+        <w:tblStyle w:val="Grilledutableau"/>
         <w:tblW w:w="0" w:type="auto"/>
         <w:tblBorders>
           <w:top w:val="none" w:sz="0" w:space="0" w:color="auto"/>
@@ -5352,7 +5320,7 @@
     </w:p>
     <w:p>
       <w:pPr>
-        <w:pStyle w:val="ListParagraph"/>
+        <w:pStyle w:val="Paragraphedeliste"/>
         <w:numPr>
           <w:ilvl w:val="0"/>
           <w:numId w:val="39"/>
@@ -5996,7 +5964,6 @@
                 <w:lang w:val="en-US"/>
               </w:rPr>
             </w:pPr>
-            <w:proofErr w:type="spellStart"/>
             <w:r>
               <w:rPr>
                 <w:b/>
@@ -6008,7 +5975,6 @@
               </w:rPr>
               <w:t>Systèmes</w:t>
             </w:r>
-            <w:proofErr w:type="spellEnd"/>
           </w:p>
         </w:tc>
         <w:tc>
@@ -6199,7 +6165,7 @@
     </w:p>
     <w:tbl>
       <w:tblPr>
-        <w:tblStyle w:val="TableGrid"/>
+        <w:tblStyle w:val="Grilledutableau"/>
         <w:tblW w:w="0" w:type="auto"/>
         <w:tblBorders>
           <w:top w:val="none" w:sz="0" w:space="0" w:color="auto"/>
@@ -6314,7 +6280,7 @@
     </w:p>
     <w:p>
       <w:pPr>
-        <w:pStyle w:val="ListParagraph"/>
+        <w:pStyle w:val="Paragraphedeliste"/>
         <w:numPr>
           <w:ilvl w:val="0"/>
           <w:numId w:val="39"/>
@@ -6944,7 +6910,6 @@
                 <w:lang w:val="en-US"/>
               </w:rPr>
             </w:pPr>
-            <w:proofErr w:type="spellStart"/>
             <w:r>
               <w:rPr>
                 <w:b/>
@@ -6956,7 +6921,6 @@
               </w:rPr>
               <w:t>Systèmes</w:t>
             </w:r>
-            <w:proofErr w:type="spellEnd"/>
           </w:p>
         </w:tc>
         <w:tc>
@@ -7147,7 +7111,7 @@
     </w:p>
     <w:tbl>
       <w:tblPr>
-        <w:tblStyle w:val="TableGrid"/>
+        <w:tblStyle w:val="Grilledutableau"/>
         <w:tblW w:w="0" w:type="auto"/>
         <w:tblBorders>
           <w:top w:val="none" w:sz="0" w:space="0" w:color="auto"/>
@@ -7262,7 +7226,7 @@
     </w:p>
     <w:p>
       <w:pPr>
-        <w:pStyle w:val="ListParagraph"/>
+        <w:pStyle w:val="Paragraphedeliste"/>
         <w:numPr>
           <w:ilvl w:val="0"/>
           <w:numId w:val="39"/>
@@ -7475,6 +7439,7 @@
         <w:pStyle w:val="activity"/>
       </w:pPr>
       <w:r>
+        <w:lastRenderedPageBreak/>
         <w:t>….</w:t>
       </w:r>
     </w:p>
@@ -7483,7 +7448,6 @@
         <w:pStyle w:val="activity"/>
       </w:pPr>
       <w:r>
-        <w:lastRenderedPageBreak/>
         <w:t>…..</w:t>
       </w:r>
     </w:p>
@@ -7883,7 +7847,6 @@
                 <w:lang w:val="en-US"/>
               </w:rPr>
             </w:pPr>
-            <w:proofErr w:type="spellStart"/>
             <w:r>
               <w:rPr>
                 <w:b/>
@@ -7895,7 +7858,6 @@
               </w:rPr>
               <w:t>Systèmes</w:t>
             </w:r>
-            <w:proofErr w:type="spellEnd"/>
           </w:p>
         </w:tc>
         <w:tc>
@@ -8086,7 +8048,7 @@
     </w:p>
     <w:tbl>
       <w:tblPr>
-        <w:tblStyle w:val="TableGrid"/>
+        <w:tblStyle w:val="Grilledutableau"/>
         <w:tblW w:w="0" w:type="auto"/>
         <w:tblBorders>
           <w:top w:val="none" w:sz="0" w:space="0" w:color="auto"/>
@@ -8201,7 +8163,7 @@
     </w:p>
     <w:p>
       <w:pPr>
-        <w:pStyle w:val="ListParagraph"/>
+        <w:pStyle w:val="Paragraphedeliste"/>
         <w:numPr>
           <w:ilvl w:val="0"/>
           <w:numId w:val="39"/>
@@ -8450,6 +8412,7 @@
         <w:pStyle w:val="activity"/>
       </w:pPr>
       <w:r>
+        <w:lastRenderedPageBreak/>
         <w:t>….</w:t>
       </w:r>
     </w:p>
@@ -8458,7 +8421,6 @@
         <w:pStyle w:val="activity"/>
       </w:pPr>
       <w:r>
-        <w:lastRenderedPageBreak/>
         <w:t>…..</w:t>
       </w:r>
     </w:p>
@@ -8817,7 +8779,6 @@
                 <w:lang w:val="en-US"/>
               </w:rPr>
             </w:pPr>
-            <w:proofErr w:type="spellStart"/>
             <w:r>
               <w:rPr>
                 <w:b/>
@@ -8829,7 +8790,6 @@
               </w:rPr>
               <w:t>Systèmes</w:t>
             </w:r>
-            <w:proofErr w:type="spellEnd"/>
           </w:p>
         </w:tc>
         <w:tc>
@@ -9048,7 +9008,7 @@
 </file>
 
 <file path=word/endnotes.xml><?xml version="1.0" encoding="utf-8"?>
-<w:endnotes xmlns:wpc="http://schemas.microsoft.com/office/word/2010/wordprocessingCanvas" xmlns:mc="http://schemas.openxmlformats.org/markup-compatibility/2006" xmlns:o="urn:schemas-microsoft-com:office:office" xmlns:r="http://schemas.openxmlformats.org/officeDocument/2006/relationships" xmlns:m="http://schemas.openxmlformats.org/officeDocument/2006/math" xmlns:v="urn:schemas-microsoft-com:vml" xmlns:wp14="http://schemas.microsoft.com/office/word/2010/wordprocessingDrawing" xmlns:wp="http://schemas.openxmlformats.org/drawingml/2006/wordprocessingDrawing" xmlns:w10="urn:schemas-microsoft-com:office:word" xmlns:w="http://schemas.openxmlformats.org/wordprocessingml/2006/main" xmlns:w14="http://schemas.microsoft.com/office/word/2010/wordml" xmlns:w15="http://schemas.microsoft.com/office/word/2012/wordml" xmlns:wpg="http://schemas.microsoft.com/office/word/2010/wordprocessingGroup" xmlns:wpi="http://schemas.microsoft.com/office/word/2010/wordprocessingInk" xmlns:wne="http://schemas.microsoft.com/office/word/2006/wordml" xmlns:wps="http://schemas.microsoft.com/office/word/2010/wordprocessingShape" mc:Ignorable="w14 w15 wp14">
+<w:endnotes xmlns:wpc="http://schemas.microsoft.com/office/word/2010/wordprocessingCanvas" xmlns:cx="http://schemas.microsoft.com/office/drawing/2014/chartex" xmlns:cx1="http://schemas.microsoft.com/office/drawing/2015/9/8/chartex" xmlns:cx2="http://schemas.microsoft.com/office/drawing/2015/10/21/chartex" xmlns:cx3="http://schemas.microsoft.com/office/drawing/2016/5/9/chartex" xmlns:cx4="http://schemas.microsoft.com/office/drawing/2016/5/10/chartex" xmlns:cx5="http://schemas.microsoft.com/office/drawing/2016/5/11/chartex" xmlns:cx6="http://schemas.microsoft.com/office/drawing/2016/5/12/chartex" xmlns:cx7="http://schemas.microsoft.com/office/drawing/2016/5/13/chartex" xmlns:cx8="http://schemas.microsoft.com/office/drawing/2016/5/14/chartex" xmlns:mc="http://schemas.openxmlformats.org/markup-compatibility/2006" xmlns:aink="http://schemas.microsoft.com/office/drawing/2016/ink" xmlns:am3d="http://schemas.microsoft.com/office/drawing/2017/model3d" xmlns:o="urn:schemas-microsoft-com:office:office" xmlns:oel="http://schemas.microsoft.com/office/2019/extlst" xmlns:r="http://schemas.openxmlformats.org/officeDocument/2006/relationships" xmlns:m="http://schemas.openxmlformats.org/officeDocument/2006/math" xmlns:v="urn:schemas-microsoft-com:vml" xmlns:wp14="http://schemas.microsoft.com/office/word/2010/wordprocessingDrawing" xmlns:wp="http://schemas.openxmlformats.org/drawingml/2006/wordprocessingDrawing" xmlns:w10="urn:schemas-microsoft-com:office:word" xmlns:w="http://schemas.openxmlformats.org/wordprocessingml/2006/main" xmlns:w14="http://schemas.microsoft.com/office/word/2010/wordml" xmlns:w15="http://schemas.microsoft.com/office/word/2012/wordml" xmlns:w16cex="http://schemas.microsoft.com/office/word/2018/wordml/cex" xmlns:w16cid="http://schemas.microsoft.com/office/word/2016/wordml/cid" xmlns:w16="http://schemas.microsoft.com/office/word/2018/wordml" xmlns:w16du="http://schemas.microsoft.com/office/word/2023/wordml/word16du" xmlns:w16sdtdh="http://schemas.microsoft.com/office/word/2020/wordml/sdtdatahash" xmlns:w16sdtfl="http://schemas.microsoft.com/office/word/2024/wordml/sdtformatlock" xmlns:w16se="http://schemas.microsoft.com/office/word/2015/wordml/symex" xmlns:wpg="http://schemas.microsoft.com/office/word/2010/wordprocessingGroup" xmlns:wpi="http://schemas.microsoft.com/office/word/2010/wordprocessingInk" xmlns:wne="http://schemas.microsoft.com/office/word/2006/wordml" xmlns:wps="http://schemas.microsoft.com/office/word/2010/wordprocessingShape" mc:Ignorable="w14 w15 w16se w16cid w16 w16cex w16sdtdh w16sdtfl w16du wp14">
   <w:endnote w:type="separator" w:id="-1">
     <w:p>
       <w:r>
@@ -9067,10 +9027,10 @@
 </file>
 
 <file path=word/footer1.xml><?xml version="1.0" encoding="utf-8"?>
-<w:ftr xmlns:wpc="http://schemas.microsoft.com/office/word/2010/wordprocessingCanvas" xmlns:mc="http://schemas.openxmlformats.org/markup-compatibility/2006" xmlns:o="urn:schemas-microsoft-com:office:office" xmlns:r="http://schemas.openxmlformats.org/officeDocument/2006/relationships" xmlns:m="http://schemas.openxmlformats.org/officeDocument/2006/math" xmlns:v="urn:schemas-microsoft-com:vml" xmlns:wp14="http://schemas.microsoft.com/office/word/2010/wordprocessingDrawing" xmlns:wp="http://schemas.openxmlformats.org/drawingml/2006/wordprocessingDrawing" xmlns:w10="urn:schemas-microsoft-com:office:word" xmlns:w="http://schemas.openxmlformats.org/wordprocessingml/2006/main" xmlns:w14="http://schemas.microsoft.com/office/word/2010/wordml" xmlns:w15="http://schemas.microsoft.com/office/word/2012/wordml" xmlns:wpg="http://schemas.microsoft.com/office/word/2010/wordprocessingGroup" xmlns:wpi="http://schemas.microsoft.com/office/word/2010/wordprocessingInk" xmlns:wne="http://schemas.microsoft.com/office/word/2006/wordml" xmlns:wps="http://schemas.microsoft.com/office/word/2010/wordprocessingShape" mc:Ignorable="w14 w15 wp14">
+<w:ftr xmlns:wpc="http://schemas.microsoft.com/office/word/2010/wordprocessingCanvas" xmlns:cx="http://schemas.microsoft.com/office/drawing/2014/chartex" xmlns:cx1="http://schemas.microsoft.com/office/drawing/2015/9/8/chartex" xmlns:cx2="http://schemas.microsoft.com/office/drawing/2015/10/21/chartex" xmlns:cx3="http://schemas.microsoft.com/office/drawing/2016/5/9/chartex" xmlns:cx4="http://schemas.microsoft.com/office/drawing/2016/5/10/chartex" xmlns:cx5="http://schemas.microsoft.com/office/drawing/2016/5/11/chartex" xmlns:cx6="http://schemas.microsoft.com/office/drawing/2016/5/12/chartex" xmlns:cx7="http://schemas.microsoft.com/office/drawing/2016/5/13/chartex" xmlns:cx8="http://schemas.microsoft.com/office/drawing/2016/5/14/chartex" xmlns:mc="http://schemas.openxmlformats.org/markup-compatibility/2006" xmlns:aink="http://schemas.microsoft.com/office/drawing/2016/ink" xmlns:am3d="http://schemas.microsoft.com/office/drawing/2017/model3d" xmlns:o="urn:schemas-microsoft-com:office:office" xmlns:oel="http://schemas.microsoft.com/office/2019/extlst" xmlns:r="http://schemas.openxmlformats.org/officeDocument/2006/relationships" xmlns:m="http://schemas.openxmlformats.org/officeDocument/2006/math" xmlns:v="urn:schemas-microsoft-com:vml" xmlns:wp14="http://schemas.microsoft.com/office/word/2010/wordprocessingDrawing" xmlns:wp="http://schemas.openxmlformats.org/drawingml/2006/wordprocessingDrawing" xmlns:w10="urn:schemas-microsoft-com:office:word" xmlns:w="http://schemas.openxmlformats.org/wordprocessingml/2006/main" xmlns:w14="http://schemas.microsoft.com/office/word/2010/wordml" xmlns:w15="http://schemas.microsoft.com/office/word/2012/wordml" xmlns:w16cex="http://schemas.microsoft.com/office/word/2018/wordml/cex" xmlns:w16cid="http://schemas.microsoft.com/office/word/2016/wordml/cid" xmlns:w16="http://schemas.microsoft.com/office/word/2018/wordml" xmlns:w16du="http://schemas.microsoft.com/office/word/2023/wordml/word16du" xmlns:w16sdtdh="http://schemas.microsoft.com/office/word/2020/wordml/sdtdatahash" xmlns:w16sdtfl="http://schemas.microsoft.com/office/word/2024/wordml/sdtformatlock" xmlns:w16se="http://schemas.microsoft.com/office/word/2015/wordml/symex" xmlns:wpg="http://schemas.microsoft.com/office/word/2010/wordprocessingGroup" xmlns:wpi="http://schemas.microsoft.com/office/word/2010/wordprocessingInk" xmlns:wne="http://schemas.microsoft.com/office/word/2006/wordml" xmlns:wps="http://schemas.microsoft.com/office/word/2010/wordprocessingShape" mc:Ignorable="w14 w15 w16se w16cid w16 w16cex w16sdtdh w16sdtfl w16du wp14">
   <w:p>
     <w:pPr>
-      <w:pStyle w:val="Footer"/>
+      <w:pStyle w:val="Pieddepage"/>
     </w:pPr>
   </w:p>
   <w:p/>
@@ -9081,10 +9041,10 @@
 </file>
 
 <file path=word/footer2.xml><?xml version="1.0" encoding="utf-8"?>
-<w:ftr xmlns:wpc="http://schemas.microsoft.com/office/word/2010/wordprocessingCanvas" xmlns:mc="http://schemas.openxmlformats.org/markup-compatibility/2006" xmlns:o="urn:schemas-microsoft-com:office:office" xmlns:r="http://schemas.openxmlformats.org/officeDocument/2006/relationships" xmlns:m="http://schemas.openxmlformats.org/officeDocument/2006/math" xmlns:v="urn:schemas-microsoft-com:vml" xmlns:wp14="http://schemas.microsoft.com/office/word/2010/wordprocessingDrawing" xmlns:wp="http://schemas.openxmlformats.org/drawingml/2006/wordprocessingDrawing" xmlns:w10="urn:schemas-microsoft-com:office:word" xmlns:w="http://schemas.openxmlformats.org/wordprocessingml/2006/main" xmlns:w14="http://schemas.microsoft.com/office/word/2010/wordml" xmlns:w15="http://schemas.microsoft.com/office/word/2012/wordml" xmlns:wpg="http://schemas.microsoft.com/office/word/2010/wordprocessingGroup" xmlns:wpi="http://schemas.microsoft.com/office/word/2010/wordprocessingInk" xmlns:wne="http://schemas.microsoft.com/office/word/2006/wordml" xmlns:wps="http://schemas.microsoft.com/office/word/2010/wordprocessingShape" mc:Ignorable="w14 w15 wp14">
+<w:ftr xmlns:wpc="http://schemas.microsoft.com/office/word/2010/wordprocessingCanvas" xmlns:cx="http://schemas.microsoft.com/office/drawing/2014/chartex" xmlns:cx1="http://schemas.microsoft.com/office/drawing/2015/9/8/chartex" xmlns:cx2="http://schemas.microsoft.com/office/drawing/2015/10/21/chartex" xmlns:cx3="http://schemas.microsoft.com/office/drawing/2016/5/9/chartex" xmlns:cx4="http://schemas.microsoft.com/office/drawing/2016/5/10/chartex" xmlns:cx5="http://schemas.microsoft.com/office/drawing/2016/5/11/chartex" xmlns:cx6="http://schemas.microsoft.com/office/drawing/2016/5/12/chartex" xmlns:cx7="http://schemas.microsoft.com/office/drawing/2016/5/13/chartex" xmlns:cx8="http://schemas.microsoft.com/office/drawing/2016/5/14/chartex" xmlns:mc="http://schemas.openxmlformats.org/markup-compatibility/2006" xmlns:aink="http://schemas.microsoft.com/office/drawing/2016/ink" xmlns:am3d="http://schemas.microsoft.com/office/drawing/2017/model3d" xmlns:o="urn:schemas-microsoft-com:office:office" xmlns:oel="http://schemas.microsoft.com/office/2019/extlst" xmlns:r="http://schemas.openxmlformats.org/officeDocument/2006/relationships" xmlns:m="http://schemas.openxmlformats.org/officeDocument/2006/math" xmlns:v="urn:schemas-microsoft-com:vml" xmlns:wp14="http://schemas.microsoft.com/office/word/2010/wordprocessingDrawing" xmlns:wp="http://schemas.openxmlformats.org/drawingml/2006/wordprocessingDrawing" xmlns:w10="urn:schemas-microsoft-com:office:word" xmlns:w="http://schemas.openxmlformats.org/wordprocessingml/2006/main" xmlns:w14="http://schemas.microsoft.com/office/word/2010/wordml" xmlns:w15="http://schemas.microsoft.com/office/word/2012/wordml" xmlns:w16cex="http://schemas.microsoft.com/office/word/2018/wordml/cex" xmlns:w16cid="http://schemas.microsoft.com/office/word/2016/wordml/cid" xmlns:w16="http://schemas.microsoft.com/office/word/2018/wordml" xmlns:w16du="http://schemas.microsoft.com/office/word/2023/wordml/word16du" xmlns:w16sdtdh="http://schemas.microsoft.com/office/word/2020/wordml/sdtdatahash" xmlns:w16sdtfl="http://schemas.microsoft.com/office/word/2024/wordml/sdtformatlock" xmlns:w16se="http://schemas.microsoft.com/office/word/2015/wordml/symex" xmlns:wpg="http://schemas.microsoft.com/office/word/2010/wordprocessingGroup" xmlns:wpi="http://schemas.microsoft.com/office/word/2010/wordprocessingInk" xmlns:wne="http://schemas.microsoft.com/office/word/2006/wordml" xmlns:wps="http://schemas.microsoft.com/office/word/2010/wordprocessingShape" mc:Ignorable="w14 w15 w16se w16cid w16 w16cex w16sdtdh w16sdtfl w16du wp14">
   <w:p>
     <w:pPr>
-      <w:pStyle w:val="Footer"/>
+      <w:pStyle w:val="Pieddepage"/>
       <w:rPr>
         <w:noProof/>
       </w:rPr>
@@ -9240,7 +9200,7 @@
             </wp:anchor>
           </w:drawing>
         </mc:Choice>
-        <mc:Fallback xmlns:oel="http://schemas.microsoft.com/office/2019/extlst" xmlns:w16du="http://schemas.microsoft.com/office/word/2023/wordml/word16du" xmlns:w16sdtfl="http://schemas.microsoft.com/office/word/2024/wordml/sdtformatlock" xmlns:a14="http://schemas.microsoft.com/office/drawing/2010/main" xmlns:a="http://schemas.openxmlformats.org/drawingml/2006/main" xmlns:w16se="http://schemas.microsoft.com/office/word/2015/wordml/symex" xmlns:w16sdtdh="http://schemas.microsoft.com/office/word/2020/wordml/sdtdatahash" xmlns:w16="http://schemas.microsoft.com/office/word/2018/wordml" xmlns:w16cid="http://schemas.microsoft.com/office/word/2016/wordml/cid" xmlns:w16cex="http://schemas.microsoft.com/office/word/2018/wordml/cex" xmlns:am3d="http://schemas.microsoft.com/office/drawing/2017/model3d" xmlns:aink="http://schemas.microsoft.com/office/drawing/2016/ink" xmlns:cx8="http://schemas.microsoft.com/office/drawing/2016/5/14/chartex" xmlns:cx7="http://schemas.microsoft.com/office/drawing/2016/5/13/chartex" xmlns:cx6="http://schemas.microsoft.com/office/drawing/2016/5/12/chartex" xmlns:cx5="http://schemas.microsoft.com/office/drawing/2016/5/11/chartex" xmlns:cx4="http://schemas.microsoft.com/office/drawing/2016/5/10/chartex" xmlns:cx3="http://schemas.microsoft.com/office/drawing/2016/5/9/chartex" xmlns:cx2="http://schemas.microsoft.com/office/drawing/2015/10/21/chartex" xmlns:cx1="http://schemas.microsoft.com/office/drawing/2015/9/8/chartex" xmlns:cx="http://schemas.microsoft.com/office/drawing/2014/chartex">
+        <mc:Fallback xmlns:a="http://schemas.openxmlformats.org/drawingml/2006/main" xmlns:a14="http://schemas.microsoft.com/office/drawing/2010/main">
           <w:pict>
             <v:group id="Zone de dessin 1" style="position:absolute;margin-left:.55pt;margin-top:4.55pt;width:496.15pt;height:14.85pt;z-index:-251657216" coordsize="63011,1885" o:spid="_x0000_s1026" editas="canvas" w14:anchorId="66D31374" o:gfxdata="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">
               <v:shapetype id="_x0000_t75" coordsize="21600,21600" filled="f" stroked="f" o:spt="75" o:preferrelative="t" path="m@4@5l@4@11@9@11@9@5xe">
@@ -9283,12 +9243,12 @@
   </w:p>
   <w:p>
     <w:pPr>
-      <w:pStyle w:val="Footer"/>
+      <w:pStyle w:val="Pieddepage"/>
     </w:pPr>
   </w:p>
   <w:tbl>
     <w:tblPr>
-      <w:tblStyle w:val="TableGrid"/>
+      <w:tblStyle w:val="Grilledutableau"/>
       <w:tblW w:w="10632" w:type="dxa"/>
       <w:tblBorders>
         <w:top w:val="none" w:sz="0" w:space="0" w:color="auto"/>
@@ -9341,8 +9301,6 @@
             </w:rPr>
             <w:t xml:space="preserve">   </w:t>
           </w:r>
-          <w:bookmarkStart w:id="5" w:name="_GoBack"/>
-          <w:bookmarkEnd w:id="5"/>
           <w:r>
             <w:rPr>
               <w:b/>
@@ -9437,17 +9395,17 @@
 </file>
 
 <file path=word/footer3.xml><?xml version="1.0" encoding="utf-8"?>
-<w:ftr xmlns:wpc="http://schemas.microsoft.com/office/word/2010/wordprocessingCanvas" xmlns:mc="http://schemas.openxmlformats.org/markup-compatibility/2006" xmlns:o="urn:schemas-microsoft-com:office:office" xmlns:r="http://schemas.openxmlformats.org/officeDocument/2006/relationships" xmlns:m="http://schemas.openxmlformats.org/officeDocument/2006/math" xmlns:v="urn:schemas-microsoft-com:vml" xmlns:wp14="http://schemas.microsoft.com/office/word/2010/wordprocessingDrawing" xmlns:wp="http://schemas.openxmlformats.org/drawingml/2006/wordprocessingDrawing" xmlns:w10="urn:schemas-microsoft-com:office:word" xmlns:w="http://schemas.openxmlformats.org/wordprocessingml/2006/main" xmlns:w14="http://schemas.microsoft.com/office/word/2010/wordml" xmlns:w15="http://schemas.microsoft.com/office/word/2012/wordml" xmlns:wpg="http://schemas.microsoft.com/office/word/2010/wordprocessingGroup" xmlns:wpi="http://schemas.microsoft.com/office/word/2010/wordprocessingInk" xmlns:wne="http://schemas.microsoft.com/office/word/2006/wordml" xmlns:wps="http://schemas.microsoft.com/office/word/2010/wordprocessingShape" mc:Ignorable="w14 w15 wp14">
+<w:ftr xmlns:wpc="http://schemas.microsoft.com/office/word/2010/wordprocessingCanvas" xmlns:cx="http://schemas.microsoft.com/office/drawing/2014/chartex" xmlns:cx1="http://schemas.microsoft.com/office/drawing/2015/9/8/chartex" xmlns:cx2="http://schemas.microsoft.com/office/drawing/2015/10/21/chartex" xmlns:cx3="http://schemas.microsoft.com/office/drawing/2016/5/9/chartex" xmlns:cx4="http://schemas.microsoft.com/office/drawing/2016/5/10/chartex" xmlns:cx5="http://schemas.microsoft.com/office/drawing/2016/5/11/chartex" xmlns:cx6="http://schemas.microsoft.com/office/drawing/2016/5/12/chartex" xmlns:cx7="http://schemas.microsoft.com/office/drawing/2016/5/13/chartex" xmlns:cx8="http://schemas.microsoft.com/office/drawing/2016/5/14/chartex" xmlns:mc="http://schemas.openxmlformats.org/markup-compatibility/2006" xmlns:aink="http://schemas.microsoft.com/office/drawing/2016/ink" xmlns:am3d="http://schemas.microsoft.com/office/drawing/2017/model3d" xmlns:o="urn:schemas-microsoft-com:office:office" xmlns:oel="http://schemas.microsoft.com/office/2019/extlst" xmlns:r="http://schemas.openxmlformats.org/officeDocument/2006/relationships" xmlns:m="http://schemas.openxmlformats.org/officeDocument/2006/math" xmlns:v="urn:schemas-microsoft-com:vml" xmlns:wp14="http://schemas.microsoft.com/office/word/2010/wordprocessingDrawing" xmlns:wp="http://schemas.openxmlformats.org/drawingml/2006/wordprocessingDrawing" xmlns:w10="urn:schemas-microsoft-com:office:word" xmlns:w="http://schemas.openxmlformats.org/wordprocessingml/2006/main" xmlns:w14="http://schemas.microsoft.com/office/word/2010/wordml" xmlns:w15="http://schemas.microsoft.com/office/word/2012/wordml" xmlns:w16cex="http://schemas.microsoft.com/office/word/2018/wordml/cex" xmlns:w16cid="http://schemas.microsoft.com/office/word/2016/wordml/cid" xmlns:w16="http://schemas.microsoft.com/office/word/2018/wordml" xmlns:w16du="http://schemas.microsoft.com/office/word/2023/wordml/word16du" xmlns:w16sdtdh="http://schemas.microsoft.com/office/word/2020/wordml/sdtdatahash" xmlns:w16sdtfl="http://schemas.microsoft.com/office/word/2024/wordml/sdtformatlock" xmlns:w16se="http://schemas.microsoft.com/office/word/2015/wordml/symex" xmlns:wpg="http://schemas.microsoft.com/office/word/2010/wordprocessingGroup" xmlns:wpi="http://schemas.microsoft.com/office/word/2010/wordprocessingInk" xmlns:wne="http://schemas.microsoft.com/office/word/2006/wordml" xmlns:wps="http://schemas.microsoft.com/office/word/2010/wordprocessingShape" mc:Ignorable="w14 w15 w16se w16cid w16 w16cex w16sdtdh w16sdtfl w16du wp14">
   <w:p>
     <w:pPr>
-      <w:pStyle w:val="Footer"/>
+      <w:pStyle w:val="Pieddepage"/>
     </w:pPr>
   </w:p>
 </w:ftr>
 </file>
 
 <file path=word/footnotes.xml><?xml version="1.0" encoding="utf-8"?>
-<w:footnotes xmlns:wpc="http://schemas.microsoft.com/office/word/2010/wordprocessingCanvas" xmlns:mc="http://schemas.openxmlformats.org/markup-compatibility/2006" xmlns:o="urn:schemas-microsoft-com:office:office" xmlns:r="http://schemas.openxmlformats.org/officeDocument/2006/relationships" xmlns:m="http://schemas.openxmlformats.org/officeDocument/2006/math" xmlns:v="urn:schemas-microsoft-com:vml" xmlns:wp14="http://schemas.microsoft.com/office/word/2010/wordprocessingDrawing" xmlns:wp="http://schemas.openxmlformats.org/drawingml/2006/wordprocessingDrawing" xmlns:w10="urn:schemas-microsoft-com:office:word" xmlns:w="http://schemas.openxmlformats.org/wordprocessingml/2006/main" xmlns:w14="http://schemas.microsoft.com/office/word/2010/wordml" xmlns:w15="http://schemas.microsoft.com/office/word/2012/wordml" xmlns:wpg="http://schemas.microsoft.com/office/word/2010/wordprocessingGroup" xmlns:wpi="http://schemas.microsoft.com/office/word/2010/wordprocessingInk" xmlns:wne="http://schemas.microsoft.com/office/word/2006/wordml" xmlns:wps="http://schemas.microsoft.com/office/word/2010/wordprocessingShape" mc:Ignorable="w14 w15 wp14">
+<w:footnotes xmlns:wpc="http://schemas.microsoft.com/office/word/2010/wordprocessingCanvas" xmlns:cx="http://schemas.microsoft.com/office/drawing/2014/chartex" xmlns:cx1="http://schemas.microsoft.com/office/drawing/2015/9/8/chartex" xmlns:cx2="http://schemas.microsoft.com/office/drawing/2015/10/21/chartex" xmlns:cx3="http://schemas.microsoft.com/office/drawing/2016/5/9/chartex" xmlns:cx4="http://schemas.microsoft.com/office/drawing/2016/5/10/chartex" xmlns:cx5="http://schemas.microsoft.com/office/drawing/2016/5/11/chartex" xmlns:cx6="http://schemas.microsoft.com/office/drawing/2016/5/12/chartex" xmlns:cx7="http://schemas.microsoft.com/office/drawing/2016/5/13/chartex" xmlns:cx8="http://schemas.microsoft.com/office/drawing/2016/5/14/chartex" xmlns:mc="http://schemas.openxmlformats.org/markup-compatibility/2006" xmlns:aink="http://schemas.microsoft.com/office/drawing/2016/ink" xmlns:am3d="http://schemas.microsoft.com/office/drawing/2017/model3d" xmlns:o="urn:schemas-microsoft-com:office:office" xmlns:oel="http://schemas.microsoft.com/office/2019/extlst" xmlns:r="http://schemas.openxmlformats.org/officeDocument/2006/relationships" xmlns:m="http://schemas.openxmlformats.org/officeDocument/2006/math" xmlns:v="urn:schemas-microsoft-com:vml" xmlns:wp14="http://schemas.microsoft.com/office/word/2010/wordprocessingDrawing" xmlns:wp="http://schemas.openxmlformats.org/drawingml/2006/wordprocessingDrawing" xmlns:w10="urn:schemas-microsoft-com:office:word" xmlns:w="http://schemas.openxmlformats.org/wordprocessingml/2006/main" xmlns:w14="http://schemas.microsoft.com/office/word/2010/wordml" xmlns:w15="http://schemas.microsoft.com/office/word/2012/wordml" xmlns:w16cex="http://schemas.microsoft.com/office/word/2018/wordml/cex" xmlns:w16cid="http://schemas.microsoft.com/office/word/2016/wordml/cid" xmlns:w16="http://schemas.microsoft.com/office/word/2018/wordml" xmlns:w16du="http://schemas.microsoft.com/office/word/2023/wordml/word16du" xmlns:w16sdtdh="http://schemas.microsoft.com/office/word/2020/wordml/sdtdatahash" xmlns:w16sdtfl="http://schemas.microsoft.com/office/word/2024/wordml/sdtformatlock" xmlns:w16se="http://schemas.microsoft.com/office/word/2015/wordml/symex" xmlns:wpg="http://schemas.microsoft.com/office/word/2010/wordprocessingGroup" xmlns:wpi="http://schemas.microsoft.com/office/word/2010/wordprocessingInk" xmlns:wne="http://schemas.microsoft.com/office/word/2006/wordml" xmlns:wps="http://schemas.microsoft.com/office/word/2010/wordprocessingShape" mc:Ignorable="w14 w15 w16se w16cid w16 w16cex w16sdtdh w16sdtfl w16du wp14">
   <w:footnote w:type="separator" w:id="-1">
     <w:p>
       <w:r>
@@ -9466,10 +9424,10 @@
 </file>
 
 <file path=word/header1.xml><?xml version="1.0" encoding="utf-8"?>
-<w:hdr xmlns:wpc="http://schemas.microsoft.com/office/word/2010/wordprocessingCanvas" xmlns:mc="http://schemas.openxmlformats.org/markup-compatibility/2006" xmlns:o="urn:schemas-microsoft-com:office:office" xmlns:r="http://schemas.openxmlformats.org/officeDocument/2006/relationships" xmlns:m="http://schemas.openxmlformats.org/officeDocument/2006/math" xmlns:v="urn:schemas-microsoft-com:vml" xmlns:wp14="http://schemas.microsoft.com/office/word/2010/wordprocessingDrawing" xmlns:wp="http://schemas.openxmlformats.org/drawingml/2006/wordprocessingDrawing" xmlns:w10="urn:schemas-microsoft-com:office:word" xmlns:w="http://schemas.openxmlformats.org/wordprocessingml/2006/main" xmlns:w14="http://schemas.microsoft.com/office/word/2010/wordml" xmlns:w15="http://schemas.microsoft.com/office/word/2012/wordml" xmlns:wpg="http://schemas.microsoft.com/office/word/2010/wordprocessingGroup" xmlns:wpi="http://schemas.microsoft.com/office/word/2010/wordprocessingInk" xmlns:wne="http://schemas.microsoft.com/office/word/2006/wordml" xmlns:wps="http://schemas.microsoft.com/office/word/2010/wordprocessingShape" mc:Ignorable="w14 w15 wp14">
+<w:hdr xmlns:wpc="http://schemas.microsoft.com/office/word/2010/wordprocessingCanvas" xmlns:cx="http://schemas.microsoft.com/office/drawing/2014/chartex" xmlns:cx1="http://schemas.microsoft.com/office/drawing/2015/9/8/chartex" xmlns:cx2="http://schemas.microsoft.com/office/drawing/2015/10/21/chartex" xmlns:cx3="http://schemas.microsoft.com/office/drawing/2016/5/9/chartex" xmlns:cx4="http://schemas.microsoft.com/office/drawing/2016/5/10/chartex" xmlns:cx5="http://schemas.microsoft.com/office/drawing/2016/5/11/chartex" xmlns:cx6="http://schemas.microsoft.com/office/drawing/2016/5/12/chartex" xmlns:cx7="http://schemas.microsoft.com/office/drawing/2016/5/13/chartex" xmlns:cx8="http://schemas.microsoft.com/office/drawing/2016/5/14/chartex" xmlns:mc="http://schemas.openxmlformats.org/markup-compatibility/2006" xmlns:aink="http://schemas.microsoft.com/office/drawing/2016/ink" xmlns:am3d="http://schemas.microsoft.com/office/drawing/2017/model3d" xmlns:o="urn:schemas-microsoft-com:office:office" xmlns:oel="http://schemas.microsoft.com/office/2019/extlst" xmlns:r="http://schemas.openxmlformats.org/officeDocument/2006/relationships" xmlns:m="http://schemas.openxmlformats.org/officeDocument/2006/math" xmlns:v="urn:schemas-microsoft-com:vml" xmlns:wp14="http://schemas.microsoft.com/office/word/2010/wordprocessingDrawing" xmlns:wp="http://schemas.openxmlformats.org/drawingml/2006/wordprocessingDrawing" xmlns:w10="urn:schemas-microsoft-com:office:word" xmlns:w="http://schemas.openxmlformats.org/wordprocessingml/2006/main" xmlns:w14="http://schemas.microsoft.com/office/word/2010/wordml" xmlns:w15="http://schemas.microsoft.com/office/word/2012/wordml" xmlns:w16cex="http://schemas.microsoft.com/office/word/2018/wordml/cex" xmlns:w16cid="http://schemas.microsoft.com/office/word/2016/wordml/cid" xmlns:w16="http://schemas.microsoft.com/office/word/2018/wordml" xmlns:w16du="http://schemas.microsoft.com/office/word/2023/wordml/word16du" xmlns:w16sdtdh="http://schemas.microsoft.com/office/word/2020/wordml/sdtdatahash" xmlns:w16sdtfl="http://schemas.microsoft.com/office/word/2024/wordml/sdtformatlock" xmlns:w16se="http://schemas.microsoft.com/office/word/2015/wordml/symex" xmlns:wpg="http://schemas.microsoft.com/office/word/2010/wordprocessingGroup" xmlns:wpi="http://schemas.microsoft.com/office/word/2010/wordprocessingInk" xmlns:wne="http://schemas.microsoft.com/office/word/2006/wordml" xmlns:wps="http://schemas.microsoft.com/office/word/2010/wordprocessingShape" mc:Ignorable="w14 w15 w16se w16cid w16 w16cex w16sdtdh w16sdtfl w16du wp14">
   <w:p>
     <w:pPr>
-      <w:pStyle w:val="Header"/>
+      <w:pStyle w:val="En-tte"/>
     </w:pPr>
   </w:p>
   <w:p/>
@@ -9480,7 +9438,7 @@
 </file>
 
 <file path=word/header2.xml><?xml version="1.0" encoding="utf-8"?>
-<w:hdr xmlns:wpc="http://schemas.microsoft.com/office/word/2010/wordprocessingCanvas" xmlns:mc="http://schemas.openxmlformats.org/markup-compatibility/2006" xmlns:o="urn:schemas-microsoft-com:office:office" xmlns:r="http://schemas.openxmlformats.org/officeDocument/2006/relationships" xmlns:m="http://schemas.openxmlformats.org/officeDocument/2006/math" xmlns:v="urn:schemas-microsoft-com:vml" xmlns:wp14="http://schemas.microsoft.com/office/word/2010/wordprocessingDrawing" xmlns:wp="http://schemas.openxmlformats.org/drawingml/2006/wordprocessingDrawing" xmlns:w10="urn:schemas-microsoft-com:office:word" xmlns:w="http://schemas.openxmlformats.org/wordprocessingml/2006/main" xmlns:w14="http://schemas.microsoft.com/office/word/2010/wordml" xmlns:w15="http://schemas.microsoft.com/office/word/2012/wordml" xmlns:wpg="http://schemas.microsoft.com/office/word/2010/wordprocessingGroup" xmlns:wpi="http://schemas.microsoft.com/office/word/2010/wordprocessingInk" xmlns:wne="http://schemas.microsoft.com/office/word/2006/wordml" xmlns:wps="http://schemas.microsoft.com/office/word/2010/wordprocessingShape" mc:Ignorable="w14 w15 wp14">
+<w:hdr xmlns:wpc="http://schemas.microsoft.com/office/word/2010/wordprocessingCanvas" xmlns:cx="http://schemas.microsoft.com/office/drawing/2014/chartex" xmlns:cx1="http://schemas.microsoft.com/office/drawing/2015/9/8/chartex" xmlns:cx2="http://schemas.microsoft.com/office/drawing/2015/10/21/chartex" xmlns:cx3="http://schemas.microsoft.com/office/drawing/2016/5/9/chartex" xmlns:cx4="http://schemas.microsoft.com/office/drawing/2016/5/10/chartex" xmlns:cx5="http://schemas.microsoft.com/office/drawing/2016/5/11/chartex" xmlns:cx6="http://schemas.microsoft.com/office/drawing/2016/5/12/chartex" xmlns:cx7="http://schemas.microsoft.com/office/drawing/2016/5/13/chartex" xmlns:cx8="http://schemas.microsoft.com/office/drawing/2016/5/14/chartex" xmlns:mc="http://schemas.openxmlformats.org/markup-compatibility/2006" xmlns:aink="http://schemas.microsoft.com/office/drawing/2016/ink" xmlns:am3d="http://schemas.microsoft.com/office/drawing/2017/model3d" xmlns:o="urn:schemas-microsoft-com:office:office" xmlns:oel="http://schemas.microsoft.com/office/2019/extlst" xmlns:r="http://schemas.openxmlformats.org/officeDocument/2006/relationships" xmlns:m="http://schemas.openxmlformats.org/officeDocument/2006/math" xmlns:v="urn:schemas-microsoft-com:vml" xmlns:wp14="http://schemas.microsoft.com/office/word/2010/wordprocessingDrawing" xmlns:wp="http://schemas.openxmlformats.org/drawingml/2006/wordprocessingDrawing" xmlns:w10="urn:schemas-microsoft-com:office:word" xmlns:w="http://schemas.openxmlformats.org/wordprocessingml/2006/main" xmlns:w14="http://schemas.microsoft.com/office/word/2010/wordml" xmlns:w15="http://schemas.microsoft.com/office/word/2012/wordml" xmlns:w16cex="http://schemas.microsoft.com/office/word/2018/wordml/cex" xmlns:w16cid="http://schemas.microsoft.com/office/word/2016/wordml/cid" xmlns:w16="http://schemas.microsoft.com/office/word/2018/wordml" xmlns:w16du="http://schemas.microsoft.com/office/word/2023/wordml/word16du" xmlns:w16sdtdh="http://schemas.microsoft.com/office/word/2020/wordml/sdtdatahash" xmlns:w16sdtfl="http://schemas.microsoft.com/office/word/2024/wordml/sdtformatlock" xmlns:w16se="http://schemas.microsoft.com/office/word/2015/wordml/symex" xmlns:wpg="http://schemas.microsoft.com/office/word/2010/wordprocessingGroup" xmlns:wpi="http://schemas.microsoft.com/office/word/2010/wordprocessingInk" xmlns:wne="http://schemas.microsoft.com/office/word/2006/wordml" xmlns:wps="http://schemas.microsoft.com/office/word/2010/wordprocessingShape" mc:Ignorable="w14 w15 w16se w16cid w16 w16cex w16sdtdh w16sdtfl w16du wp14">
   <w:tbl>
     <w:tblPr>
       <w:tblW w:w="0" w:type="auto"/>
@@ -9501,7 +9459,7 @@
         </w:tcPr>
         <w:p>
           <w:pPr>
-            <w:pStyle w:val="Header"/>
+            <w:pStyle w:val="En-tte"/>
             <w:ind w:left="-115"/>
           </w:pPr>
         </w:p>
@@ -9512,7 +9470,7 @@
         </w:tcPr>
         <w:p>
           <w:pPr>
-            <w:pStyle w:val="Header"/>
+            <w:pStyle w:val="En-tte"/>
             <w:jc w:val="center"/>
           </w:pPr>
         </w:p>
@@ -9523,7 +9481,7 @@
         </w:tcPr>
         <w:p>
           <w:pPr>
-            <w:pStyle w:val="Header"/>
+            <w:pStyle w:val="En-tte"/>
             <w:ind w:right="-115"/>
             <w:jc w:val="right"/>
           </w:pPr>
@@ -9533,27 +9491,27 @@
   </w:tbl>
   <w:p>
     <w:pPr>
-      <w:pStyle w:val="Header"/>
+      <w:pStyle w:val="En-tte"/>
     </w:pPr>
   </w:p>
 </w:hdr>
 </file>
 
 <file path=word/header3.xml><?xml version="1.0" encoding="utf-8"?>
-<w:hdr xmlns:wpc="http://schemas.microsoft.com/office/word/2010/wordprocessingCanvas" xmlns:mc="http://schemas.openxmlformats.org/markup-compatibility/2006" xmlns:o="urn:schemas-microsoft-com:office:office" xmlns:r="http://schemas.openxmlformats.org/officeDocument/2006/relationships" xmlns:m="http://schemas.openxmlformats.org/officeDocument/2006/math" xmlns:v="urn:schemas-microsoft-com:vml" xmlns:wp14="http://schemas.microsoft.com/office/word/2010/wordprocessingDrawing" xmlns:wp="http://schemas.openxmlformats.org/drawingml/2006/wordprocessingDrawing" xmlns:w10="urn:schemas-microsoft-com:office:word" xmlns:w="http://schemas.openxmlformats.org/wordprocessingml/2006/main" xmlns:w14="http://schemas.microsoft.com/office/word/2010/wordml" xmlns:w15="http://schemas.microsoft.com/office/word/2012/wordml" xmlns:wpg="http://schemas.microsoft.com/office/word/2010/wordprocessingGroup" xmlns:wpi="http://schemas.microsoft.com/office/word/2010/wordprocessingInk" xmlns:wne="http://schemas.microsoft.com/office/word/2006/wordml" xmlns:wps="http://schemas.microsoft.com/office/word/2010/wordprocessingShape" mc:Ignorable="w14 w15 wp14">
+<w:hdr xmlns:wpc="http://schemas.microsoft.com/office/word/2010/wordprocessingCanvas" xmlns:cx="http://schemas.microsoft.com/office/drawing/2014/chartex" xmlns:cx1="http://schemas.microsoft.com/office/drawing/2015/9/8/chartex" xmlns:cx2="http://schemas.microsoft.com/office/drawing/2015/10/21/chartex" xmlns:cx3="http://schemas.microsoft.com/office/drawing/2016/5/9/chartex" xmlns:cx4="http://schemas.microsoft.com/office/drawing/2016/5/10/chartex" xmlns:cx5="http://schemas.microsoft.com/office/drawing/2016/5/11/chartex" xmlns:cx6="http://schemas.microsoft.com/office/drawing/2016/5/12/chartex" xmlns:cx7="http://schemas.microsoft.com/office/drawing/2016/5/13/chartex" xmlns:cx8="http://schemas.microsoft.com/office/drawing/2016/5/14/chartex" xmlns:mc="http://schemas.openxmlformats.org/markup-compatibility/2006" xmlns:aink="http://schemas.microsoft.com/office/drawing/2016/ink" xmlns:am3d="http://schemas.microsoft.com/office/drawing/2017/model3d" xmlns:o="urn:schemas-microsoft-com:office:office" xmlns:oel="http://schemas.microsoft.com/office/2019/extlst" xmlns:r="http://schemas.openxmlformats.org/officeDocument/2006/relationships" xmlns:m="http://schemas.openxmlformats.org/officeDocument/2006/math" xmlns:v="urn:schemas-microsoft-com:vml" xmlns:wp14="http://schemas.microsoft.com/office/word/2010/wordprocessingDrawing" xmlns:wp="http://schemas.openxmlformats.org/drawingml/2006/wordprocessingDrawing" xmlns:w10="urn:schemas-microsoft-com:office:word" xmlns:w="http://schemas.openxmlformats.org/wordprocessingml/2006/main" xmlns:w14="http://schemas.microsoft.com/office/word/2010/wordml" xmlns:w15="http://schemas.microsoft.com/office/word/2012/wordml" xmlns:w16cex="http://schemas.microsoft.com/office/word/2018/wordml/cex" xmlns:w16cid="http://schemas.microsoft.com/office/word/2016/wordml/cid" xmlns:w16="http://schemas.microsoft.com/office/word/2018/wordml" xmlns:w16du="http://schemas.microsoft.com/office/word/2023/wordml/word16du" xmlns:w16sdtdh="http://schemas.microsoft.com/office/word/2020/wordml/sdtdatahash" xmlns:w16sdtfl="http://schemas.microsoft.com/office/word/2024/wordml/sdtformatlock" xmlns:w16se="http://schemas.microsoft.com/office/word/2015/wordml/symex" xmlns:wpg="http://schemas.microsoft.com/office/word/2010/wordprocessingGroup" xmlns:wpi="http://schemas.microsoft.com/office/word/2010/wordprocessingInk" xmlns:wne="http://schemas.microsoft.com/office/word/2006/wordml" xmlns:wps="http://schemas.microsoft.com/office/word/2010/wordprocessingShape" mc:Ignorable="w14 w15 w16se w16cid w16 w16cex w16sdtdh w16sdtfl w16du wp14">
   <w:p>
     <w:pPr>
-      <w:pStyle w:val="Header"/>
+      <w:pStyle w:val="En-tte"/>
     </w:pPr>
   </w:p>
 </w:hdr>
 </file>
 
 <file path=word/numbering.xml><?xml version="1.0" encoding="utf-8"?>
-<w:numbering xmlns:wpc="http://schemas.microsoft.com/office/word/2010/wordprocessingCanvas" xmlns:mc="http://schemas.openxmlformats.org/markup-compatibility/2006" xmlns:o="urn:schemas-microsoft-com:office:office" xmlns:r="http://schemas.openxmlformats.org/officeDocument/2006/relationships" xmlns:m="http://schemas.openxmlformats.org/officeDocument/2006/math" xmlns:v="urn:schemas-microsoft-com:vml" xmlns:wp14="http://schemas.microsoft.com/office/word/2010/wordprocessingDrawing" xmlns:wp="http://schemas.openxmlformats.org/drawingml/2006/wordprocessingDrawing" xmlns:w10="urn:schemas-microsoft-com:office:word" xmlns:w="http://schemas.openxmlformats.org/wordprocessingml/2006/main" xmlns:w14="http://schemas.microsoft.com/office/word/2010/wordml" xmlns:w15="http://schemas.microsoft.com/office/word/2012/wordml" xmlns:wpg="http://schemas.microsoft.com/office/word/2010/wordprocessingGroup" xmlns:wpi="http://schemas.microsoft.com/office/word/2010/wordprocessingInk" xmlns:wne="http://schemas.microsoft.com/office/word/2006/wordml" xmlns:wps="http://schemas.microsoft.com/office/word/2010/wordprocessingShape" mc:Ignorable="w14 w15 wp14">
+<w:numbering xmlns:wpc="http://schemas.microsoft.com/office/word/2010/wordprocessingCanvas" xmlns:cx="http://schemas.microsoft.com/office/drawing/2014/chartex" xmlns:cx1="http://schemas.microsoft.com/office/drawing/2015/9/8/chartex" xmlns:cx2="http://schemas.microsoft.com/office/drawing/2015/10/21/chartex" xmlns:cx3="http://schemas.microsoft.com/office/drawing/2016/5/9/chartex" xmlns:cx4="http://schemas.microsoft.com/office/drawing/2016/5/10/chartex" xmlns:cx5="http://schemas.microsoft.com/office/drawing/2016/5/11/chartex" xmlns:cx6="http://schemas.microsoft.com/office/drawing/2016/5/12/chartex" xmlns:cx7="http://schemas.microsoft.com/office/drawing/2016/5/13/chartex" xmlns:cx8="http://schemas.microsoft.com/office/drawing/2016/5/14/chartex" xmlns:mc="http://schemas.openxmlformats.org/markup-compatibility/2006" xmlns:aink="http://schemas.microsoft.com/office/drawing/2016/ink" xmlns:am3d="http://schemas.microsoft.com/office/drawing/2017/model3d" xmlns:o="urn:schemas-microsoft-com:office:office" xmlns:oel="http://schemas.microsoft.com/office/2019/extlst" xmlns:r="http://schemas.openxmlformats.org/officeDocument/2006/relationships" xmlns:m="http://schemas.openxmlformats.org/officeDocument/2006/math" xmlns:v="urn:schemas-microsoft-com:vml" xmlns:wp14="http://schemas.microsoft.com/office/word/2010/wordprocessingDrawing" xmlns:wp="http://schemas.openxmlformats.org/drawingml/2006/wordprocessingDrawing" xmlns:w10="urn:schemas-microsoft-com:office:word" xmlns:w="http://schemas.openxmlformats.org/wordprocessingml/2006/main" xmlns:w14="http://schemas.microsoft.com/office/word/2010/wordml" xmlns:w15="http://schemas.microsoft.com/office/word/2012/wordml" xmlns:w16cex="http://schemas.microsoft.com/office/word/2018/wordml/cex" xmlns:w16cid="http://schemas.microsoft.com/office/word/2016/wordml/cid" xmlns:w16="http://schemas.microsoft.com/office/word/2018/wordml" xmlns:w16du="http://schemas.microsoft.com/office/word/2023/wordml/word16du" xmlns:w16sdtdh="http://schemas.microsoft.com/office/word/2020/wordml/sdtdatahash" xmlns:w16sdtfl="http://schemas.microsoft.com/office/word/2024/wordml/sdtformatlock" xmlns:w16se="http://schemas.microsoft.com/office/word/2015/wordml/symex" xmlns:wpg="http://schemas.microsoft.com/office/word/2010/wordprocessingGroup" xmlns:wpi="http://schemas.microsoft.com/office/word/2010/wordprocessingInk" xmlns:wne="http://schemas.microsoft.com/office/word/2006/wordml" xmlns:wps="http://schemas.microsoft.com/office/word/2010/wordprocessingShape" mc:Ignorable="w14 w15 w16se w16cid w16 w16cex w16sdtdh w16sdtfl w16du wp14">
   <w:numPicBullet w:numPicBulletId="0">
     <w:pict>
-      <v:shapetype id="_x0000_t75" coordsize="21600,21600" o:spt="75" o:preferrelative="t" path="m@4@5l@4@11@9@11@9@5xe" filled="f" stroked="f">
+      <v:shapetype w14:anchorId="7700487D" id="_x0000_t75" coordsize="21600,21600" o:spt="75" o:preferrelative="t" path="m@4@5l@4@11@9@11@9@5xe" filled="f" stroked="f">
         <v:stroke joinstyle="miter"/>
         <v:formulas>
           <v:f eqn="if lineDrawn pixelLineWidth 0"/>
@@ -9572,33 +9530,33 @@
         <v:path o:extrusionok="f" gradientshapeok="t" o:connecttype="rect"/>
         <o:lock v:ext="edit" aspectratio="t"/>
       </v:shapetype>
-      <v:shape id="_x0000_i1038" type="#_x0000_t75" style="width:43.2pt;height:43.2pt;visibility:visible;mso-wrap-style:square" o:bullet="t">
+      <v:shape id="_x0000_i1025" type="#_x0000_t75" style="width:43.5pt;height:43.5pt;visibility:visible;mso-wrap-style:square" o:bullet="t">
         <v:imagedata r:id="rId1" o:title=""/>
       </v:shape>
     </w:pict>
   </w:numPicBullet>
   <w:numPicBullet w:numPicBulletId="1">
     <w:pict>
-      <v:shape w14:anchorId="69CE8F46" id="_x0000_i1039" type="#_x0000_t75" style="width:65.1pt;height:43.2pt;visibility:visible;mso-wrap-style:square" o:bullet="t">
+      <v:shape id="_x0000_i1026" type="#_x0000_t75" style="width:65.25pt;height:43.5pt;visibility:visible;mso-wrap-style:square" o:bullet="t">
         <v:imagedata r:id="rId2" o:title=""/>
       </v:shape>
     </w:pict>
   </w:numPicBullet>
   <w:numPicBullet w:numPicBulletId="2">
     <w:pict>
-      <v:shape id="_x0000_i1040" type="#_x0000_t75" style="width:43.2pt;height:43.2pt;visibility:visible;mso-wrap-style:square" o:bullet="t">
+      <v:shape id="_x0000_i1027" type="#_x0000_t75" style="width:43.5pt;height:43.5pt;visibility:visible;mso-wrap-style:square" o:bullet="t">
         <v:imagedata r:id="rId3" o:title=""/>
       </v:shape>
     </w:pict>
   </w:numPicBullet>
   <w:numPicBullet w:numPicBulletId="3">
     <w:pict>
-      <v:shape id="_x0000_i1041" type="#_x0000_t75" style="width:6.9pt;height:8.05pt;visibility:visible;mso-wrap-style:square" o:bullet="t">
+      <v:shape id="_x0000_i1028" type="#_x0000_t75" style="width:6.75pt;height:8.25pt;visibility:visible;mso-wrap-style:square" o:bullet="t">
         <v:imagedata r:id="rId4" o:title=""/>
       </v:shape>
     </w:pict>
   </w:numPicBullet>
-  <w:abstractNum w:abstractNumId="0">
+  <w:abstractNum w:abstractNumId="0" w15:restartNumberingAfterBreak="0">
     <w:nsid w:val="06510050"/>
     <w:multiLevelType w:val="hybridMultilevel"/>
     <w:tmpl w:val="1736B446"/>
@@ -9739,7 +9697,7 @@
       </w:rPr>
     </w:lvl>
   </w:abstractNum>
-  <w:abstractNum w:abstractNumId="1">
+  <w:abstractNum w:abstractNumId="1" w15:restartNumberingAfterBreak="0">
     <w:nsid w:val="0A8E1107"/>
     <w:multiLevelType w:val="hybridMultilevel"/>
     <w:tmpl w:val="130E60DE"/>
@@ -9851,7 +9809,7 @@
       </w:rPr>
     </w:lvl>
   </w:abstractNum>
-  <w:abstractNum w:abstractNumId="2">
+  <w:abstractNum w:abstractNumId="2" w15:restartNumberingAfterBreak="0">
     <w:nsid w:val="12E5103E"/>
     <w:multiLevelType w:val="multilevel"/>
     <w:tmpl w:val="AB347BD2"/>
@@ -10000,7 +9958,7 @@
       </w:rPr>
     </w:lvl>
   </w:abstractNum>
-  <w:abstractNum w:abstractNumId="3">
+  <w:abstractNum w:abstractNumId="3" w15:restartNumberingAfterBreak="0">
     <w:nsid w:val="1596623E"/>
     <w:multiLevelType w:val="hybridMultilevel"/>
     <w:tmpl w:val="A87E72CC"/>
@@ -10147,7 +10105,7 @@
       </w:rPr>
     </w:lvl>
   </w:abstractNum>
-  <w:abstractNum w:abstractNumId="4">
+  <w:abstractNum w:abstractNumId="4" w15:restartNumberingAfterBreak="0">
     <w:nsid w:val="15BE4E7B"/>
     <w:multiLevelType w:val="multilevel"/>
     <w:tmpl w:val="CA361004"/>
@@ -10261,7 +10219,7 @@
       </w:rPr>
     </w:lvl>
   </w:abstractNum>
-  <w:abstractNum w:abstractNumId="5">
+  <w:abstractNum w:abstractNumId="5" w15:restartNumberingAfterBreak="0">
     <w:nsid w:val="1890703D"/>
     <w:multiLevelType w:val="hybridMultilevel"/>
     <w:tmpl w:val="3F949196"/>
@@ -10408,7 +10366,7 @@
       </w:rPr>
     </w:lvl>
   </w:abstractNum>
-  <w:abstractNum w:abstractNumId="6">
+  <w:abstractNum w:abstractNumId="6" w15:restartNumberingAfterBreak="0">
     <w:nsid w:val="19B5624B"/>
     <w:multiLevelType w:val="multilevel"/>
     <w:tmpl w:val="DABC1620"/>
@@ -10555,7 +10513,7 @@
       </w:rPr>
     </w:lvl>
   </w:abstractNum>
-  <w:abstractNum w:abstractNumId="7">
+  <w:abstractNum w:abstractNumId="7" w15:restartNumberingAfterBreak="0">
     <w:nsid w:val="1CFC3278"/>
     <w:multiLevelType w:val="multilevel"/>
     <w:tmpl w:val="ABCAF46E"/>
@@ -10668,7 +10626,7 @@
       </w:pPr>
     </w:lvl>
   </w:abstractNum>
-  <w:abstractNum w:abstractNumId="8">
+  <w:abstractNum w:abstractNumId="8" w15:restartNumberingAfterBreak="0">
     <w:nsid w:val="1F4B418F"/>
     <w:multiLevelType w:val="multilevel"/>
     <w:tmpl w:val="A794561A"/>
@@ -10781,7 +10739,7 @@
       </w:pPr>
     </w:lvl>
   </w:abstractNum>
-  <w:abstractNum w:abstractNumId="9">
+  <w:abstractNum w:abstractNumId="9" w15:restartNumberingAfterBreak="0">
     <w:nsid w:val="20267FCA"/>
     <w:multiLevelType w:val="multilevel"/>
     <w:tmpl w:val="9F6EA76E"/>
@@ -10930,7 +10888,7 @@
       </w:rPr>
     </w:lvl>
   </w:abstractNum>
-  <w:abstractNum w:abstractNumId="10">
+  <w:abstractNum w:abstractNumId="10" w15:restartNumberingAfterBreak="0">
     <w:nsid w:val="218238EC"/>
     <w:multiLevelType w:val="multilevel"/>
     <w:tmpl w:val="A77E0F76"/>
@@ -11071,7 +11029,7 @@
       </w:rPr>
     </w:lvl>
   </w:abstractNum>
-  <w:abstractNum w:abstractNumId="11">
+  <w:abstractNum w:abstractNumId="11" w15:restartNumberingAfterBreak="0">
     <w:nsid w:val="29415034"/>
     <w:multiLevelType w:val="multilevel"/>
     <w:tmpl w:val="CC10275E"/>
@@ -11218,7 +11176,7 @@
       </w:rPr>
     </w:lvl>
   </w:abstractNum>
-  <w:abstractNum w:abstractNumId="12">
+  <w:abstractNum w:abstractNumId="12" w15:restartNumberingAfterBreak="0">
     <w:nsid w:val="2AB4756F"/>
     <w:multiLevelType w:val="multilevel"/>
     <w:tmpl w:val="44C6D480"/>
@@ -11364,7 +11322,7 @@
       </w:rPr>
     </w:lvl>
   </w:abstractNum>
-  <w:abstractNum w:abstractNumId="13">
+  <w:abstractNum w:abstractNumId="13" w15:restartNumberingAfterBreak="0">
     <w:nsid w:val="2F50532E"/>
     <w:multiLevelType w:val="multilevel"/>
     <w:tmpl w:val="F39E9E9A"/>
@@ -11505,7 +11463,7 @@
       </w:rPr>
     </w:lvl>
   </w:abstractNum>
-  <w:abstractNum w:abstractNumId="14">
+  <w:abstractNum w:abstractNumId="14" w15:restartNumberingAfterBreak="0">
     <w:nsid w:val="305C08FE"/>
     <w:multiLevelType w:val="multilevel"/>
     <w:tmpl w:val="515A813C"/>
@@ -11618,7 +11576,7 @@
       </w:pPr>
     </w:lvl>
   </w:abstractNum>
-  <w:abstractNum w:abstractNumId="15">
+  <w:abstractNum w:abstractNumId="15" w15:restartNumberingAfterBreak="0">
     <w:nsid w:val="3A29647D"/>
     <w:multiLevelType w:val="multilevel"/>
     <w:tmpl w:val="625856D8"/>
@@ -11759,7 +11717,7 @@
       </w:rPr>
     </w:lvl>
   </w:abstractNum>
-  <w:abstractNum w:abstractNumId="16">
+  <w:abstractNum w:abstractNumId="16" w15:restartNumberingAfterBreak="0">
     <w:nsid w:val="3DB50362"/>
     <w:multiLevelType w:val="multilevel"/>
     <w:tmpl w:val="23AE38D6"/>
@@ -11899,7 +11857,7 @@
       </w:rPr>
     </w:lvl>
   </w:abstractNum>
-  <w:abstractNum w:abstractNumId="17">
+  <w:abstractNum w:abstractNumId="17" w15:restartNumberingAfterBreak="0">
     <w:nsid w:val="3E9F1D8C"/>
     <w:multiLevelType w:val="hybridMultilevel"/>
     <w:tmpl w:val="E5B4DC62"/>
@@ -12039,7 +11997,7 @@
       </w:rPr>
     </w:lvl>
   </w:abstractNum>
-  <w:abstractNum w:abstractNumId="18">
+  <w:abstractNum w:abstractNumId="18" w15:restartNumberingAfterBreak="0">
     <w:nsid w:val="451045F8"/>
     <w:multiLevelType w:val="hybridMultilevel"/>
     <w:tmpl w:val="34726FC0"/>
@@ -12179,7 +12137,7 @@
       </w:rPr>
     </w:lvl>
   </w:abstractNum>
-  <w:abstractNum w:abstractNumId="19">
+  <w:abstractNum w:abstractNumId="19" w15:restartNumberingAfterBreak="0">
     <w:nsid w:val="489B324D"/>
     <w:multiLevelType w:val="multilevel"/>
     <w:tmpl w:val="CAF83CF6"/>
@@ -12293,7 +12251,7 @@
       </w:rPr>
     </w:lvl>
   </w:abstractNum>
-  <w:abstractNum w:abstractNumId="20">
+  <w:abstractNum w:abstractNumId="20" w15:restartNumberingAfterBreak="0">
     <w:nsid w:val="4E7F1A74"/>
     <w:multiLevelType w:val="multilevel"/>
     <w:tmpl w:val="74683CA2"/>
@@ -12407,7 +12365,7 @@
       </w:rPr>
     </w:lvl>
   </w:abstractNum>
-  <w:abstractNum w:abstractNumId="21">
+  <w:abstractNum w:abstractNumId="21" w15:restartNumberingAfterBreak="0">
     <w:nsid w:val="54700CED"/>
     <w:multiLevelType w:val="multilevel"/>
     <w:tmpl w:val="2FB83000"/>
@@ -12520,7 +12478,7 @@
       </w:pPr>
     </w:lvl>
   </w:abstractNum>
-  <w:abstractNum w:abstractNumId="22">
+  <w:abstractNum w:abstractNumId="22" w15:restartNumberingAfterBreak="0">
     <w:nsid w:val="548A72AD"/>
     <w:multiLevelType w:val="hybridMultilevel"/>
     <w:tmpl w:val="DFE4BE3A"/>
@@ -12633,7 +12591,7 @@
       </w:rPr>
     </w:lvl>
   </w:abstractNum>
-  <w:abstractNum w:abstractNumId="23">
+  <w:abstractNum w:abstractNumId="23" w15:restartNumberingAfterBreak="0">
     <w:nsid w:val="587C5A98"/>
     <w:multiLevelType w:val="multilevel"/>
     <w:tmpl w:val="622811C6"/>
@@ -12782,7 +12740,7 @@
       </w:rPr>
     </w:lvl>
   </w:abstractNum>
-  <w:abstractNum w:abstractNumId="24">
+  <w:abstractNum w:abstractNumId="24" w15:restartNumberingAfterBreak="0">
     <w:nsid w:val="5B3A0EBA"/>
     <w:multiLevelType w:val="hybridMultilevel"/>
     <w:tmpl w:val="3D8A68F6"/>
@@ -12928,7 +12886,7 @@
       </w:rPr>
     </w:lvl>
   </w:abstractNum>
-  <w:abstractNum w:abstractNumId="25">
+  <w:abstractNum w:abstractNumId="25" w15:restartNumberingAfterBreak="0">
     <w:nsid w:val="5DDB5637"/>
     <w:multiLevelType w:val="hybridMultilevel"/>
     <w:tmpl w:val="B2B2C93A"/>
@@ -13071,7 +13029,7 @@
       </w:rPr>
     </w:lvl>
   </w:abstractNum>
-  <w:abstractNum w:abstractNumId="26">
+  <w:abstractNum w:abstractNumId="26" w15:restartNumberingAfterBreak="0">
     <w:nsid w:val="5FB74032"/>
     <w:multiLevelType w:val="multilevel"/>
     <w:tmpl w:val="E1AC15C0"/>
@@ -13184,7 +13142,7 @@
       </w:pPr>
     </w:lvl>
   </w:abstractNum>
-  <w:abstractNum w:abstractNumId="27">
+  <w:abstractNum w:abstractNumId="27" w15:restartNumberingAfterBreak="0">
     <w:nsid w:val="676F68B7"/>
     <w:multiLevelType w:val="multilevel"/>
     <w:tmpl w:val="EDB4B9A2"/>
@@ -13297,7 +13255,7 @@
       </w:pPr>
     </w:lvl>
   </w:abstractNum>
-  <w:abstractNum w:abstractNumId="28">
+  <w:abstractNum w:abstractNumId="28" w15:restartNumberingAfterBreak="0">
     <w:nsid w:val="67AB4788"/>
     <w:multiLevelType w:val="multilevel"/>
     <w:tmpl w:val="DABC1620"/>
@@ -13444,7 +13402,7 @@
       </w:rPr>
     </w:lvl>
   </w:abstractNum>
-  <w:abstractNum w:abstractNumId="29">
+  <w:abstractNum w:abstractNumId="29" w15:restartNumberingAfterBreak="0">
     <w:nsid w:val="6B5B4F6F"/>
     <w:multiLevelType w:val="multilevel"/>
     <w:tmpl w:val="2E68CCD2"/>
@@ -13557,7 +13515,7 @@
       </w:rPr>
     </w:lvl>
   </w:abstractNum>
-  <w:abstractNum w:abstractNumId="30">
+  <w:abstractNum w:abstractNumId="30" w15:restartNumberingAfterBreak="0">
     <w:nsid w:val="6BC53459"/>
     <w:multiLevelType w:val="hybridMultilevel"/>
     <w:tmpl w:val="74567A26"/>
@@ -13698,7 +13656,7 @@
       </w:rPr>
     </w:lvl>
   </w:abstractNum>
-  <w:abstractNum w:abstractNumId="31">
+  <w:abstractNum w:abstractNumId="31" w15:restartNumberingAfterBreak="0">
     <w:nsid w:val="6C2639FA"/>
     <w:multiLevelType w:val="multilevel"/>
     <w:tmpl w:val="42AAC758"/>
@@ -13845,7 +13803,7 @@
       </w:rPr>
     </w:lvl>
   </w:abstractNum>
-  <w:abstractNum w:abstractNumId="32">
+  <w:abstractNum w:abstractNumId="32" w15:restartNumberingAfterBreak="0">
     <w:nsid w:val="6FFF4B8C"/>
     <w:multiLevelType w:val="hybridMultilevel"/>
     <w:tmpl w:val="77BA9E72"/>
@@ -13960,7 +13918,7 @@
       </w:rPr>
     </w:lvl>
   </w:abstractNum>
-  <w:abstractNum w:abstractNumId="33">
+  <w:abstractNum w:abstractNumId="33" w15:restartNumberingAfterBreak="0">
     <w:nsid w:val="7A294D01"/>
     <w:multiLevelType w:val="hybridMultilevel"/>
     <w:tmpl w:val="CC10275E"/>
@@ -14107,7 +14065,7 @@
       </w:rPr>
     </w:lvl>
   </w:abstractNum>
-  <w:abstractNum w:abstractNumId="34">
+  <w:abstractNum w:abstractNumId="34" w15:restartNumberingAfterBreak="0">
     <w:nsid w:val="7B955083"/>
     <w:multiLevelType w:val="hybridMultilevel"/>
     <w:tmpl w:val="25E8AAEA"/>
@@ -14254,7 +14212,7 @@
       </w:rPr>
     </w:lvl>
   </w:abstractNum>
-  <w:abstractNum w:abstractNumId="35">
+  <w:abstractNum w:abstractNumId="35" w15:restartNumberingAfterBreak="0">
     <w:nsid w:val="7E486701"/>
     <w:multiLevelType w:val="multilevel"/>
     <w:tmpl w:val="D974D160"/>
@@ -14394,7 +14352,7 @@
       </w:rPr>
     </w:lvl>
   </w:abstractNum>
-  <w:abstractNum w:abstractNumId="36">
+  <w:abstractNum w:abstractNumId="36" w15:restartNumberingAfterBreak="0">
     <w:nsid w:val="7E486708"/>
     <w:multiLevelType w:val="hybridMultilevel"/>
     <w:tmpl w:val="26AAB5F4"/>
@@ -14509,7 +14467,7 @@
       </w:rPr>
     </w:lvl>
   </w:abstractNum>
-  <w:abstractNum w:abstractNumId="37">
+  <w:abstractNum w:abstractNumId="37" w15:restartNumberingAfterBreak="0">
     <w:nsid w:val="7E486712"/>
     <w:multiLevelType w:val="hybridMultilevel"/>
     <w:tmpl w:val="D53C0A90"/>
@@ -14651,130 +14609,130 @@
       </w:rPr>
     </w:lvl>
   </w:abstractNum>
-  <w:num w:numId="1">
+  <w:num w:numId="1" w16cid:durableId="918716117">
     <w:abstractNumId w:val="17"/>
   </w:num>
-  <w:num w:numId="2">
+  <w:num w:numId="2" w16cid:durableId="647593960">
     <w:abstractNumId w:val="18"/>
   </w:num>
-  <w:num w:numId="3">
+  <w:num w:numId="3" w16cid:durableId="1208376547">
     <w:abstractNumId w:val="35"/>
   </w:num>
-  <w:num w:numId="4">
+  <w:num w:numId="4" w16cid:durableId="480463847">
     <w:abstractNumId w:val="24"/>
   </w:num>
-  <w:num w:numId="5">
+  <w:num w:numId="5" w16cid:durableId="644968923">
     <w:abstractNumId w:val="12"/>
   </w:num>
-  <w:num w:numId="6">
+  <w:num w:numId="6" w16cid:durableId="299573668">
     <w:abstractNumId w:val="34"/>
   </w:num>
-  <w:num w:numId="7">
+  <w:num w:numId="7" w16cid:durableId="1236430530">
     <w:abstractNumId w:val="28"/>
   </w:num>
-  <w:num w:numId="8">
+  <w:num w:numId="8" w16cid:durableId="322591319">
     <w:abstractNumId w:val="6"/>
   </w:num>
-  <w:num w:numId="9">
+  <w:num w:numId="9" w16cid:durableId="2127305844">
     <w:abstractNumId w:val="3"/>
   </w:num>
-  <w:num w:numId="10">
+  <w:num w:numId="10" w16cid:durableId="1502507795">
     <w:abstractNumId w:val="31"/>
   </w:num>
-  <w:num w:numId="11">
+  <w:num w:numId="11" w16cid:durableId="1094596186">
     <w:abstractNumId w:val="33"/>
   </w:num>
-  <w:num w:numId="12">
+  <w:num w:numId="12" w16cid:durableId="734670340">
     <w:abstractNumId w:val="16"/>
   </w:num>
-  <w:num w:numId="13">
+  <w:num w:numId="13" w16cid:durableId="1785729584">
     <w:abstractNumId w:val="0"/>
   </w:num>
-  <w:num w:numId="14">
+  <w:num w:numId="14" w16cid:durableId="409424260">
     <w:abstractNumId w:val="15"/>
   </w:num>
-  <w:num w:numId="15">
+  <w:num w:numId="15" w16cid:durableId="143157166">
     <w:abstractNumId w:val="30"/>
   </w:num>
-  <w:num w:numId="16">
+  <w:num w:numId="16" w16cid:durableId="1257908015">
     <w:abstractNumId w:val="11"/>
   </w:num>
-  <w:num w:numId="17">
+  <w:num w:numId="17" w16cid:durableId="428820528">
     <w:abstractNumId w:val="5"/>
   </w:num>
-  <w:num w:numId="18">
+  <w:num w:numId="18" w16cid:durableId="1955476828">
     <w:abstractNumId w:val="13"/>
   </w:num>
-  <w:num w:numId="19">
+  <w:num w:numId="19" w16cid:durableId="1081175474">
     <w:abstractNumId w:val="25"/>
   </w:num>
-  <w:num w:numId="20">
+  <w:num w:numId="20" w16cid:durableId="1484421872">
     <w:abstractNumId w:val="32"/>
   </w:num>
-  <w:num w:numId="21">
+  <w:num w:numId="21" w16cid:durableId="28527895">
     <w:abstractNumId w:val="29"/>
   </w:num>
-  <w:num w:numId="22">
+  <w:num w:numId="22" w16cid:durableId="1518159817">
     <w:abstractNumId w:val="32"/>
     <w:lvlOverride w:ilvl="0">
       <w:startOverride w:val="1"/>
     </w:lvlOverride>
   </w:num>
-  <w:num w:numId="23">
+  <w:num w:numId="23" w16cid:durableId="240722317">
     <w:abstractNumId w:val="4"/>
   </w:num>
-  <w:num w:numId="24">
+  <w:num w:numId="24" w16cid:durableId="1616213816">
     <w:abstractNumId w:val="32"/>
     <w:lvlOverride w:ilvl="0">
       <w:startOverride w:val="1"/>
     </w:lvlOverride>
   </w:num>
-  <w:num w:numId="25">
+  <w:num w:numId="25" w16cid:durableId="13386842">
     <w:abstractNumId w:val="20"/>
   </w:num>
-  <w:num w:numId="26">
+  <w:num w:numId="26" w16cid:durableId="865024611">
     <w:abstractNumId w:val="32"/>
     <w:lvlOverride w:ilvl="0">
       <w:startOverride w:val="1"/>
     </w:lvlOverride>
   </w:num>
-  <w:num w:numId="27">
+  <w:num w:numId="27" w16cid:durableId="1354263666">
     <w:abstractNumId w:val="19"/>
   </w:num>
-  <w:num w:numId="28">
+  <w:num w:numId="28" w16cid:durableId="910626696">
     <w:abstractNumId w:val="10"/>
   </w:num>
-  <w:num w:numId="29">
+  <w:num w:numId="29" w16cid:durableId="1663007278">
     <w:abstractNumId w:val="32"/>
   </w:num>
-  <w:num w:numId="30">
+  <w:num w:numId="30" w16cid:durableId="1148398336">
     <w:abstractNumId w:val="25"/>
   </w:num>
-  <w:num w:numId="31">
+  <w:num w:numId="31" w16cid:durableId="1383366475">
     <w:abstractNumId w:val="36"/>
   </w:num>
-  <w:num w:numId="32">
+  <w:num w:numId="32" w16cid:durableId="1975403923">
     <w:abstractNumId w:val="25"/>
     <w:lvlOverride w:ilvl="0">
       <w:startOverride w:val="1"/>
     </w:lvlOverride>
   </w:num>
-  <w:num w:numId="33">
+  <w:num w:numId="33" w16cid:durableId="20522545">
     <w:abstractNumId w:val="37"/>
   </w:num>
-  <w:num w:numId="34">
+  <w:num w:numId="34" w16cid:durableId="1240797451">
     <w:abstractNumId w:val="25"/>
     <w:lvlOverride w:ilvl="0">
       <w:startOverride w:val="1"/>
     </w:lvlOverride>
   </w:num>
-  <w:num w:numId="35">
+  <w:num w:numId="35" w16cid:durableId="1202860545">
     <w:abstractNumId w:val="25"/>
     <w:lvlOverride w:ilvl="0">
       <w:startOverride w:val="1"/>
     </w:lvlOverride>
   </w:num>
-  <w:num w:numId="36">
+  <w:num w:numId="36" w16cid:durableId="1353875411">
     <w:abstractNumId w:val="27"/>
     <w:lvlOverride w:ilvl="0">
       <w:startOverride w:val="1"/>
@@ -14804,10 +14762,10 @@
       <w:startOverride w:val="1"/>
     </w:lvlOverride>
   </w:num>
-  <w:num w:numId="37">
+  <w:num w:numId="37" w16cid:durableId="1692994072">
     <w:abstractNumId w:val="23"/>
   </w:num>
-  <w:num w:numId="38">
+  <w:num w:numId="38" w16cid:durableId="305666750">
     <w:abstractNumId w:val="7"/>
     <w:lvlOverride w:ilvl="0">
       <w:startOverride w:val="2"/>
@@ -14837,13 +14795,13 @@
       <w:startOverride w:val="1"/>
     </w:lvlOverride>
   </w:num>
-  <w:num w:numId="39">
+  <w:num w:numId="39" w16cid:durableId="645091402">
     <w:abstractNumId w:val="1"/>
   </w:num>
-  <w:num w:numId="40">
+  <w:num w:numId="40" w16cid:durableId="1380667671">
     <w:abstractNumId w:val="2"/>
   </w:num>
-  <w:num w:numId="41">
+  <w:num w:numId="41" w16cid:durableId="1953248249">
     <w:abstractNumId w:val="8"/>
     <w:lvlOverride w:ilvl="0">
       <w:startOverride w:val="3"/>
@@ -14873,10 +14831,10 @@
       <w:startOverride w:val="1"/>
     </w:lvlOverride>
   </w:num>
-  <w:num w:numId="42">
+  <w:num w:numId="42" w16cid:durableId="929194812">
     <w:abstractNumId w:val="22"/>
   </w:num>
-  <w:num w:numId="43">
+  <w:num w:numId="43" w16cid:durableId="233319076">
     <w:abstractNumId w:val="21"/>
     <w:lvlOverride w:ilvl="0">
       <w:startOverride w:val="4"/>
@@ -14906,7 +14864,7 @@
       <w:startOverride w:val="1"/>
     </w:lvlOverride>
   </w:num>
-  <w:num w:numId="44">
+  <w:num w:numId="44" w16cid:durableId="1509129115">
     <w:abstractNumId w:val="26"/>
     <w:lvlOverride w:ilvl="0">
       <w:startOverride w:val="5"/>
@@ -14936,7 +14894,7 @@
       <w:startOverride w:val="1"/>
     </w:lvlOverride>
   </w:num>
-  <w:num w:numId="45">
+  <w:num w:numId="45" w16cid:durableId="1386180813">
     <w:abstractNumId w:val="14"/>
     <w:lvlOverride w:ilvl="0">
       <w:startOverride w:val="6"/>
@@ -14966,14 +14924,14 @@
       <w:startOverride w:val="1"/>
     </w:lvlOverride>
   </w:num>
-  <w:num w:numId="46">
+  <w:num w:numId="46" w16cid:durableId="1826510305">
     <w:abstractNumId w:val="9"/>
   </w:num>
 </w:numbering>
 </file>
 
 <file path=word/styles.xml><?xml version="1.0" encoding="utf-8"?>
-<w:styles xmlns:mc="http://schemas.openxmlformats.org/markup-compatibility/2006" xmlns:r="http://schemas.openxmlformats.org/officeDocument/2006/relationships" xmlns:w="http://schemas.openxmlformats.org/wordprocessingml/2006/main" xmlns:w14="http://schemas.microsoft.com/office/word/2010/wordml" xmlns:w15="http://schemas.microsoft.com/office/word/2012/wordml" mc:Ignorable="w14 w15">
+<w:styles xmlns:mc="http://schemas.openxmlformats.org/markup-compatibility/2006" xmlns:r="http://schemas.openxmlformats.org/officeDocument/2006/relationships" xmlns:w="http://schemas.openxmlformats.org/wordprocessingml/2006/main" xmlns:w14="http://schemas.microsoft.com/office/word/2010/wordml" xmlns:w15="http://schemas.microsoft.com/office/word/2012/wordml" xmlns:w16cex="http://schemas.microsoft.com/office/word/2018/wordml/cex" xmlns:w16cid="http://schemas.microsoft.com/office/word/2016/wordml/cid" xmlns:w16="http://schemas.microsoft.com/office/word/2018/wordml" xmlns:w16du="http://schemas.microsoft.com/office/word/2023/wordml/word16du" xmlns:w16sdtdh="http://schemas.microsoft.com/office/word/2020/wordml/sdtdatahash" xmlns:w16sdtfl="http://schemas.microsoft.com/office/word/2024/wordml/sdtformatlock" xmlns:w16se="http://schemas.microsoft.com/office/word/2015/wordml/symex" mc:Ignorable="w14 w15 w16se w16cid w16 w16cex w16sdtdh w16sdtfl w16du">
   <w:docDefaults>
     <w:rPrDefault>
       <w:rPr>
@@ -14983,7 +14941,7 @@
     </w:rPrDefault>
     <w:pPrDefault/>
   </w:docDefaults>
-  <w:latentStyles w:defLockedState="0" w:defUIPriority="0" w:defSemiHidden="0" w:defUnhideWhenUsed="0" w:defQFormat="0" w:count="371">
+  <w:latentStyles w:defLockedState="0" w:defUIPriority="0" w:defSemiHidden="0" w:defUnhideWhenUsed="0" w:defQFormat="0" w:count="376">
     <w:lsdException w:name="Normal" w:qFormat="1"/>
     <w:lsdException w:name="heading 1" w:qFormat="1"/>
     <w:lsdException w:name="heading 2" w:semiHidden="1" w:unhideWhenUsed="1" w:qFormat="1"/>
@@ -15349,6 +15307,11 @@
     <w:lsdException w:name="List Table 5 Dark Accent 6" w:uiPriority="50"/>
     <w:lsdException w:name="List Table 6 Colorful Accent 6" w:uiPriority="51"/>
     <w:lsdException w:name="List Table 7 Colorful Accent 6" w:uiPriority="52"/>
+    <w:lsdException w:name="Mention" w:semiHidden="1" w:uiPriority="99" w:unhideWhenUsed="1"/>
+    <w:lsdException w:name="Smart Hyperlink" w:semiHidden="1" w:uiPriority="99" w:unhideWhenUsed="1"/>
+    <w:lsdException w:name="Hashtag" w:semiHidden="1" w:uiPriority="99" w:unhideWhenUsed="1"/>
+    <w:lsdException w:name="Unresolved Mention" w:semiHidden="1" w:uiPriority="99" w:unhideWhenUsed="1"/>
+    <w:lsdException w:name="Smart Link" w:semiHidden="1" w:uiPriority="99" w:unhideWhenUsed="1"/>
   </w:latentStyles>
   <w:style w:type="paragraph" w:default="1" w:styleId="Normal">
     <w:name w:val="Normal"/>
@@ -15370,13 +15333,13 @@
       <w:szCs w:val="16"/>
     </w:rPr>
   </w:style>
-  <w:style w:type="character" w:default="1" w:styleId="DefaultParagraphFont">
+  <w:style w:type="character" w:default="1" w:styleId="Policepardfaut">
     <w:name w:val="Default Paragraph Font"/>
     <w:uiPriority w:val="1"/>
     <w:semiHidden/>
     <w:unhideWhenUsed/>
   </w:style>
-  <w:style w:type="table" w:default="1" w:styleId="TableNormal">
+  <w:style w:type="table" w:default="1" w:styleId="TableauNormal">
     <w:name w:val="Normal Table"/>
     <w:uiPriority w:val="99"/>
     <w:semiHidden/>
@@ -15391,7 +15354,7 @@
       </w:tblCellMar>
     </w:tblPr>
   </w:style>
-  <w:style w:type="numbering" w:default="1" w:styleId="NoList">
+  <w:style w:type="numbering" w:default="1" w:styleId="Aucuneliste">
     <w:name w:val="No List"/>
     <w:uiPriority w:val="99"/>
     <w:semiHidden/>
@@ -15417,7 +15380,7 @@
       <w:sz w:val="36"/>
     </w:rPr>
   </w:style>
-  <w:style w:type="paragraph" w:styleId="Header">
+  <w:style w:type="paragraph" w:styleId="En-tte">
     <w:name w:val="header"/>
     <w:basedOn w:val="Normal"/>
     <w:rsid w:val="005D4D9A"/>
@@ -15428,10 +15391,10 @@
       </w:tabs>
     </w:pPr>
   </w:style>
-  <w:style w:type="paragraph" w:styleId="Footer">
+  <w:style w:type="paragraph" w:styleId="Pieddepage">
     <w:name w:val="footer"/>
     <w:basedOn w:val="Normal"/>
-    <w:link w:val="FooterChar"/>
+    <w:link w:val="PieddepageCar"/>
     <w:uiPriority w:val="99"/>
     <w:rsid w:val="005D4D9A"/>
     <w:pPr>
@@ -15543,7 +15506,7 @@
       <w:iCs/>
     </w:rPr>
   </w:style>
-  <w:style w:type="paragraph" w:styleId="BodyText">
+  <w:style w:type="paragraph" w:styleId="Corpsdetexte">
     <w:name w:val="Body Text"/>
     <w:basedOn w:val="Normal"/>
     <w:rsid w:val="00B128DE"/>
@@ -15620,7 +15583,7 @@
   </w:style>
   <w:style w:type="paragraph" w:customStyle="1" w:styleId="dure">
     <w:name w:val="durée"/>
-    <w:basedOn w:val="BodyText2"/>
+    <w:basedOn w:val="Corpsdetexte2"/>
     <w:rsid w:val="00B128DE"/>
     <w:pPr>
       <w:spacing w:after="0" w:line="240" w:lineRule="auto"/>
@@ -15630,7 +15593,7 @@
       <w:szCs w:val="20"/>
     </w:rPr>
   </w:style>
-  <w:style w:type="paragraph" w:styleId="BodyText2">
+  <w:style w:type="paragraph" w:styleId="Corpsdetexte2">
     <w:name w:val="Body Text 2"/>
     <w:basedOn w:val="Normal"/>
     <w:rsid w:val="00B128DE"/>
@@ -15638,9 +15601,9 @@
       <w:spacing w:after="120" w:line="480" w:lineRule="auto"/>
     </w:pPr>
   </w:style>
-  <w:style w:type="character" w:styleId="PageNumber">
+  <w:style w:type="character" w:styleId="Numrodepage">
     <w:name w:val="page number"/>
-    <w:basedOn w:val="DefaultParagraphFont"/>
+    <w:basedOn w:val="Policepardfaut"/>
     <w:rsid w:val="00B128DE"/>
   </w:style>
   <w:style w:type="paragraph" w:customStyle="1" w:styleId="titrelrubrique">
@@ -15669,7 +15632,7 @@
   </w:style>
   <w:style w:type="paragraph" w:customStyle="1" w:styleId="NOMPRENOM">
     <w:name w:val="NOM/PRENOM"/>
-    <w:basedOn w:val="Footer"/>
+    <w:basedOn w:val="Pieddepage"/>
     <w:rsid w:val="00143CA5"/>
     <w:pPr>
       <w:tabs>
@@ -15683,7 +15646,7 @@
   </w:style>
   <w:style w:type="paragraph" w:customStyle="1" w:styleId="INTITULREFPROJET">
     <w:name w:val="INTITULÉ/REF PROJET"/>
-    <w:basedOn w:val="BodyText"/>
+    <w:basedOn w:val="Corpsdetexte"/>
     <w:rsid w:val="00143CA5"/>
     <w:rPr>
       <w:b/>
@@ -15708,10 +15671,10 @@
       <w:noProof/>
     </w:rPr>
   </w:style>
-  <w:style w:type="character" w:customStyle="1" w:styleId="FooterChar">
-    <w:name w:val="Footer Char"/>
-    <w:basedOn w:val="DefaultParagraphFont"/>
-    <w:link w:val="Footer"/>
+  <w:style w:type="character" w:customStyle="1" w:styleId="PieddepageCar">
+    <w:name w:val="Pied de page Car"/>
+    <w:basedOn w:val="Policepardfaut"/>
+    <w:link w:val="Pieddepage"/>
     <w:uiPriority w:val="99"/>
     <w:rsid w:val="003D3802"/>
     <w:rPr>
@@ -15720,10 +15683,10 @@
       <w:szCs w:val="24"/>
     </w:rPr>
   </w:style>
-  <w:style w:type="paragraph" w:styleId="BalloonText">
+  <w:style w:type="paragraph" w:styleId="Textedebulles">
     <w:name w:val="Balloon Text"/>
     <w:basedOn w:val="Normal"/>
-    <w:link w:val="BalloonTextChar"/>
+    <w:link w:val="TextedebullesCar"/>
     <w:rsid w:val="007B74E5"/>
     <w:rPr>
       <w:rFonts w:ascii="Lucida Grande" w:hAnsi="Lucida Grande"/>
@@ -15731,10 +15694,10 @@
       <w:szCs w:val="18"/>
     </w:rPr>
   </w:style>
-  <w:style w:type="character" w:customStyle="1" w:styleId="BalloonTextChar">
-    <w:name w:val="Balloon Text Char"/>
-    <w:basedOn w:val="DefaultParagraphFont"/>
-    <w:link w:val="BalloonText"/>
+  <w:style w:type="character" w:customStyle="1" w:styleId="TextedebullesCar">
+    <w:name w:val="Texte de bulles Car"/>
+    <w:basedOn w:val="Policepardfaut"/>
+    <w:link w:val="Textedebulles"/>
     <w:rsid w:val="007B74E5"/>
     <w:rPr>
       <w:rFonts w:ascii="Lucida Grande" w:hAnsi="Lucida Grande"/>
@@ -15742,13 +15705,12 @@
       <w:szCs w:val="18"/>
     </w:rPr>
   </w:style>
-  <w:style w:type="table" w:styleId="TableGrid">
+  <w:style w:type="table" w:styleId="Grilledutableau">
     <w:name w:val="Table Grid"/>
-    <w:basedOn w:val="TableNormal"/>
+    <w:basedOn w:val="TableauNormal"/>
     <w:uiPriority w:val="59"/>
     <w:rsid w:val="00044E85"/>
     <w:tblPr>
-      <w:tblInd w:w="0" w:type="dxa"/>
       <w:tblBorders>
         <w:top w:val="single" w:sz="4" w:space="0" w:color="auto"/>
         <w:left w:val="single" w:sz="4" w:space="0" w:color="auto"/>
@@ -15757,17 +15719,11 @@
         <w:insideH w:val="single" w:sz="4" w:space="0" w:color="auto"/>
         <w:insideV w:val="single" w:sz="4" w:space="0" w:color="auto"/>
       </w:tblBorders>
-      <w:tblCellMar>
-        <w:top w:w="0" w:type="dxa"/>
-        <w:left w:w="108" w:type="dxa"/>
-        <w:bottom w:w="0" w:type="dxa"/>
-        <w:right w:w="108" w:type="dxa"/>
-      </w:tblCellMar>
     </w:tblPr>
   </w:style>
-  <w:style w:type="character" w:styleId="Hyperlink">
+  <w:style w:type="character" w:styleId="Lienhypertexte">
     <w:name w:val="Hyperlink"/>
-    <w:basedOn w:val="DefaultParagraphFont"/>
+    <w:basedOn w:val="Policepardfaut"/>
     <w:unhideWhenUsed/>
     <w:rsid w:val="00971D21"/>
     <w:rPr>
@@ -15814,7 +15770,7 @@
   </w:style>
   <w:style w:type="character" w:customStyle="1" w:styleId="ImageCar">
     <w:name w:val="Image Car"/>
-    <w:basedOn w:val="DefaultParagraphFont"/>
+    <w:basedOn w:val="Policepardfaut"/>
     <w:link w:val="Image"/>
     <w:rsid w:val="00F15E09"/>
     <w:rPr>
@@ -15870,7 +15826,7 @@
   </w:style>
   <w:style w:type="character" w:customStyle="1" w:styleId="Sous-tcheCar">
     <w:name w:val="Sous-tâche Car"/>
-    <w:basedOn w:val="DefaultParagraphFont"/>
+    <w:basedOn w:val="Policepardfaut"/>
     <w:link w:val="Sous-tche"/>
     <w:rsid w:val="00D32294"/>
     <w:rPr>
@@ -15907,7 +15863,7 @@
   </w:style>
   <w:style w:type="character" w:customStyle="1" w:styleId="listTitleCar">
     <w:name w:val="listTitle Car"/>
-    <w:basedOn w:val="DefaultParagraphFont"/>
+    <w:basedOn w:val="Policepardfaut"/>
     <w:link w:val="listTitle"/>
     <w:rsid w:val="00D269E1"/>
     <w:rPr>
@@ -15919,7 +15875,7 @@
   </w:style>
   <w:style w:type="character" w:customStyle="1" w:styleId="TcheCar">
     <w:name w:val="Tâche Car"/>
-    <w:basedOn w:val="DefaultParagraphFont"/>
+    <w:basedOn w:val="Policepardfaut"/>
     <w:link w:val="Tche"/>
     <w:rsid w:val="00B77271"/>
     <w:rPr>
@@ -15940,7 +15896,7 @@
       <w:lang w:val="en-US"/>
     </w:rPr>
   </w:style>
-  <w:style w:type="paragraph" w:styleId="ListParagraph">
+  <w:style w:type="paragraph" w:styleId="Paragraphedeliste">
     <w:name w:val="List Paragraph"/>
     <w:basedOn w:val="Normal"/>
     <w:uiPriority w:val="34"/>
@@ -15963,9 +15919,9 @@
       <w:lang w:eastAsia="en-US"/>
     </w:rPr>
   </w:style>
-  <w:style w:type="character" w:styleId="Strong">
+  <w:style w:type="character" w:styleId="lev">
     <w:name w:val="Strong"/>
-    <w:basedOn w:val="DefaultParagraphFont"/>
+    <w:basedOn w:val="Policepardfaut"/>
     <w:uiPriority w:val="22"/>
     <w:qFormat/>
     <w:rsid w:val="00C10270"/>
@@ -16919,6 +16875,10 @@
 </file>
 
 <file path=customXml/item1.xml><?xml version="1.0" encoding="utf-8"?>
+<LongProperties xmlns="http://schemas.microsoft.com/office/2006/metadata/longProperties"/>
+</file>
+
+<file path=customXml/item2.xml><?xml version="1.0" encoding="utf-8"?>
 <ct:contentTypeSchema xmlns:ct="http://schemas.microsoft.com/office/2006/metadata/contentType" xmlns:ma="http://schemas.microsoft.com/office/2006/metadata/properties/metaAttributes" ct:_="" ma:_="" ma:contentTypeName="Document" ma:contentTypeID="0x010100A3CA1B408E8E4B4FBAE07298AB85BDD0" ma:contentTypeVersion="2" ma:contentTypeDescription="Create a new document." ma:contentTypeScope="" ma:versionID="54f07e138cd7ab2e06fdbd1c3522eb9c">
   <xsd:schema xmlns:xsd="http://www.w3.org/2001/XMLSchema" xmlns:p="http://schemas.microsoft.com/office/2006/metadata/properties" xmlns:ns2="594baba4-ddf1-4441-b192-378ce97d7503" targetNamespace="http://schemas.microsoft.com/office/2006/metadata/properties" ma:root="true" ma:fieldsID="fbd22ef19c19cc1cd549d114b6f459ef" ns2:_="">
     <xsd:import namespace="594baba4-ddf1-4441-b192-378ce97d7503"/>
@@ -16980,11 +16940,11 @@
 </ct:contentTypeSchema>
 </file>
 
-<file path=customXml/item2.xml><?xml version="1.0" encoding="utf-8"?>
-<LongProperties xmlns="http://schemas.microsoft.com/office/2006/metadata/longProperties"/>
+<file path=customXml/item3.xml><?xml version="1.0" encoding="utf-8"?>
+<b:Sources xmlns:b="http://schemas.openxmlformats.org/officeDocument/2006/bibliography" xmlns="http://schemas.openxmlformats.org/officeDocument/2006/bibliography" SelectedStyle="\APA.XSL" StyleName="APA"/>
 </file>
 
-<file path=customXml/item3.xml><?xml version="1.0" encoding="utf-8"?>
+<file path=customXml/item4.xml><?xml version="1.0" encoding="utf-8"?>
 <?mso-contentType ?>
 <FormTemplates xmlns="http://schemas.microsoft.com/sharepoint/v3/contenttype/forms">
   <Display>DocumentLibraryForm</Display>
@@ -16993,11 +16953,15 @@
 </FormTemplates>
 </file>
 
-<file path=customXml/item4.xml><?xml version="1.0" encoding="utf-8"?>
-<b:Sources xmlns:b="http://schemas.openxmlformats.org/officeDocument/2006/bibliography" xmlns="http://schemas.openxmlformats.org/officeDocument/2006/bibliography" SelectedStyle="\APA.XSL" StyleName="APA"/>
+<file path=customXml/itemProps1.xml><?xml version="1.0" encoding="utf-8"?>
+<ds:datastoreItem xmlns:ds="http://schemas.openxmlformats.org/officeDocument/2006/customXml" ds:itemID="{647C7A8F-9755-42A0-844B-4AD918516A30}">
+  <ds:schemaRefs>
+    <ds:schemaRef ds:uri="http://schemas.microsoft.com/office/2006/metadata/longProperties"/>
+  </ds:schemaRefs>
+</ds:datastoreItem>
 </file>
 
-<file path=customXml/itemProps1.xml><?xml version="1.0" encoding="utf-8"?>
+<file path=customXml/itemProps2.xml><?xml version="1.0" encoding="utf-8"?>
 <ds:datastoreItem xmlns:ds="http://schemas.openxmlformats.org/officeDocument/2006/customXml" ds:itemID="{167D7672-4853-491D-B255-EA33F9C4D2DB}">
   <ds:schemaRefs>
     <ds:schemaRef ds:uri="http://schemas.microsoft.com/office/2006/metadata/contentType"/>
@@ -17014,26 +16978,18 @@
 </ds:datastoreItem>
 </file>
 
-<file path=customXml/itemProps2.xml><?xml version="1.0" encoding="utf-8"?>
-<ds:datastoreItem xmlns:ds="http://schemas.openxmlformats.org/officeDocument/2006/customXml" ds:itemID="{647C7A8F-9755-42A0-844B-4AD918516A30}">
+<file path=customXml/itemProps3.xml><?xml version="1.0" encoding="utf-8"?>
+<ds:datastoreItem xmlns:ds="http://schemas.openxmlformats.org/officeDocument/2006/customXml" ds:itemID="{E974F1FA-33C8-41EC-A0D5-9ECB76277E5E}">
   <ds:schemaRefs>
-    <ds:schemaRef ds:uri="http://schemas.microsoft.com/office/2006/metadata/longProperties"/>
+    <ds:schemaRef ds:uri="http://schemas.openxmlformats.org/officeDocument/2006/bibliography"/>
   </ds:schemaRefs>
 </ds:datastoreItem>
 </file>
 
-<file path=customXml/itemProps3.xml><?xml version="1.0" encoding="utf-8"?>
+<file path=customXml/itemProps4.xml><?xml version="1.0" encoding="utf-8"?>
 <ds:datastoreItem xmlns:ds="http://schemas.openxmlformats.org/officeDocument/2006/customXml" ds:itemID="{BECD7B25-234A-48C9-B7A9-A41EEFC8D1DD}">
   <ds:schemaRefs>
     <ds:schemaRef ds:uri="http://schemas.microsoft.com/sharepoint/v3/contenttype/forms"/>
   </ds:schemaRefs>
 </ds:datastoreItem>
-</file>
-
-<file path=customXml/itemProps4.xml><?xml version="1.0" encoding="utf-8"?>
-<ds:datastoreItem xmlns:ds="http://schemas.openxmlformats.org/officeDocument/2006/customXml" ds:itemID="{E974F1FA-33C8-41EC-A0D5-9ECB76277E5E}">
-  <ds:schemaRefs>
-    <ds:schemaRef ds:uri="http://schemas.openxmlformats.org/officeDocument/2006/bibliography"/>
-  </ds:schemaRefs>
-</ds:datastoreItem>
 </file>
</xml_diff>